<commit_message>
feat: complete alignment with teacher rubrics - standalone interactive flexdashboard, comprehensive viva guide, and viral linkedin publication kit
</commit_message>
<xml_diff>
--- a/reports/AIRGUARD_360_Project_Report.docx
+++ b/reports/AIRGUARD_360_Project_Report.docx
@@ -17402,7 +17402,7 @@
     <w:bookmarkEnd w:id="118"/>
     <w:bookmarkEnd w:id="119"/>
     <w:bookmarkEnd w:id="120"/>
-    <w:bookmarkStart w:id="123" w:name="Xe6de61dbdb8fc57913da9e5dda7c7e708e7cf7a"/>
+    <w:bookmarkStart w:id="124" w:name="Xe6de61dbdb8fc57913da9e5dda7c7e708e7cf7a"/>
     <w:p>
       <w:pPr>
         <w:pStyle w:val="Heading1"/>
@@ -17919,8 +17919,311 @@
       </w:r>
     </w:p>
     <w:bookmarkEnd w:id="122"/>
+    <w:bookmarkStart w:id="123" w:name="X9f3e3d48f30a73d9a428690cf83400c745bfeb6"/>
+    <w:p>
+      <w:pPr>
+        <w:pStyle w:val="Heading2"/>
+      </w:pPr>
+      <w:r>
+        <w:rPr>
+          <w:rStyle w:val="SectionNumber"/>
+        </w:rPr>
+        <w:t xml:space="preserve">5.3</w:t>
+      </w:r>
+      <w:r>
+        <w:tab/>
+      </w:r>
+      <w:r>
+        <w:t xml:space="preserve">5.3 Standalone Interactive R Markdown Dashboard (</w:t>
+      </w:r>
+      <w:r>
+        <w:rPr>
+          <w:rStyle w:val="VerbatimChar"/>
+        </w:rPr>
+        <w:t xml:space="preserve">dashboard.Rmd</w:t>
+      </w:r>
+      <w:r>
+        <w:t xml:space="preserve"> </w:t>
+      </w:r>
+      <w:r>
+        <w:t xml:space="preserve">/</w:t>
+      </w:r>
+      <w:r>
+        <w:t xml:space="preserve"> </w:t>
+      </w:r>
+      <w:r>
+        <w:rPr>
+          <w:rStyle w:val="VerbatimChar"/>
+        </w:rPr>
+        <w:t xml:space="preserve">dashboard.html</w:t>
+      </w:r>
+      <w:r>
+        <w:t xml:space="preserve">)</w:t>
+      </w:r>
+    </w:p>
+    <w:p>
+      <w:pPr>
+        <w:pStyle w:val="FirstParagraph"/>
+      </w:pPr>
+      <w:r>
+        <w:t xml:space="preserve">To fulfill the teacher’s requirement for an</w:t>
+      </w:r>
+      <w:r>
+        <w:t xml:space="preserve"> </w:t>
+      </w:r>
+      <w:r>
+        <w:rPr>
+          <w:b/>
+          <w:bCs/>
+        </w:rPr>
+        <w:t xml:space="preserve">Interactive Dashboard using R Markdown</w:t>
+      </w:r>
+      <w:r>
+        <w:t xml:space="preserve">, a dedicated, high-performance dashboard was engineered using the</w:t>
+      </w:r>
+      <w:r>
+        <w:t xml:space="preserve"> </w:t>
+      </w:r>
+      <w:r>
+        <w:rPr>
+          <w:rStyle w:val="VerbatimChar"/>
+        </w:rPr>
+        <w:t xml:space="preserve">flexdashboard</w:t>
+      </w:r>
+      <w:r>
+        <w:t xml:space="preserve">,</w:t>
+      </w:r>
+      <w:r>
+        <w:t xml:space="preserve"> </w:t>
+      </w:r>
+      <w:r>
+        <w:rPr>
+          <w:rStyle w:val="VerbatimChar"/>
+        </w:rPr>
+        <w:t xml:space="preserve">plotly</w:t>
+      </w:r>
+      <w:r>
+        <w:t xml:space="preserve">, and</w:t>
+      </w:r>
+      <w:r>
+        <w:t xml:space="preserve"> </w:t>
+      </w:r>
+      <w:r>
+        <w:rPr>
+          <w:rStyle w:val="VerbatimChar"/>
+        </w:rPr>
+        <w:t xml:space="preserve">DT</w:t>
+      </w:r>
+      <w:r>
+        <w:t xml:space="preserve"> </w:t>
+      </w:r>
+      <w:r>
+        <w:t xml:space="preserve">packages:</w:t>
+      </w:r>
+      <w:r>
+        <w:t xml:space="preserve"> </w:t>
+      </w:r>
+      <w:r>
+        <w:t xml:space="preserve">-</w:t>
+      </w:r>
+      <w:r>
+        <w:t xml:space="preserve"> </w:t>
+      </w:r>
+      <w:r>
+        <w:rPr>
+          <w:b/>
+          <w:bCs/>
+        </w:rPr>
+        <w:t xml:space="preserve">Zero-Server Portability:</w:t>
+      </w:r>
+      <w:r>
+        <w:t xml:space="preserve"> </w:t>
+      </w:r>
+      <w:r>
+        <w:t xml:space="preserve">The dashboard compiles to a standalone, client-side HTML bundle (</w:t>
+      </w:r>
+      <w:r>
+        <w:rPr>
+          <w:rStyle w:val="VerbatimChar"/>
+        </w:rPr>
+        <w:t xml:space="preserve">dashboard.html</w:t>
+      </w:r>
+      <w:r>
+        <w:t xml:space="preserve"> </w:t>
+      </w:r>
+      <w:r>
+        <w:t xml:space="preserve">/</w:t>
+      </w:r>
+      <w:r>
+        <w:t xml:space="preserve"> </w:t>
+      </w:r>
+      <w:r>
+        <w:rPr>
+          <w:rStyle w:val="VerbatimChar"/>
+        </w:rPr>
+        <w:t xml:space="preserve">reports/airguard_dashboard.html</w:t>
+      </w:r>
+      <w:r>
+        <w:t xml:space="preserve">), operating seamlessly across all modern browsers without requiring an active R runtime or server process.</w:t>
+      </w:r>
+      <w:r>
+        <w:t xml:space="preserve"> </w:t>
+      </w:r>
+      <w:r>
+        <w:t xml:space="preserve">-</w:t>
+      </w:r>
+      <w:r>
+        <w:t xml:space="preserve"> </w:t>
+      </w:r>
+      <w:r>
+        <w:rPr>
+          <w:b/>
+          <w:bCs/>
+        </w:rPr>
+        <w:t xml:space="preserve">Structured Multi-Page Views:</w:t>
+      </w:r>
+      <w:r>
+        <w:t xml:space="preserve"> </w:t>
+      </w:r>
+      <w:r>
+        <w:t xml:space="preserve">Six dedicated tabs mirror the syllabus:</w:t>
+      </w:r>
+      <w:r>
+        <w:t xml:space="preserve"> </w:t>
+      </w:r>
+      <w:r>
+        <w:t xml:space="preserve">1.</w:t>
+      </w:r>
+      <w:r>
+        <w:t xml:space="preserve"> </w:t>
+      </w:r>
+      <w:r>
+        <w:rPr>
+          <w:i/>
+          <w:iCs/>
+        </w:rPr>
+        <w:t xml:space="preserve">Overview &amp; Trends:</w:t>
+      </w:r>
+      <w:r>
+        <w:t xml:space="preserve"> </w:t>
+      </w:r>
+      <w:r>
+        <w:t xml:space="preserve">Dynamic KPI value boxes, temporal PM2.5 trajectories with 7-day moving averages, and CPCB category distributions.</w:t>
+      </w:r>
+      <w:r>
+        <w:t xml:space="preserve"> </w:t>
+      </w:r>
+      <w:r>
+        <w:t xml:space="preserve">2.</w:t>
+      </w:r>
+      <w:r>
+        <w:t xml:space="preserve"> </w:t>
+      </w:r>
+      <w:r>
+        <w:rPr>
+          <w:i/>
+          <w:iCs/>
+        </w:rPr>
+        <w:t xml:space="preserve">Geographic Intelligence &amp; Hotspots:</w:t>
+      </w:r>
+      <w:r>
+        <w:t xml:space="preserve"> </w:t>
+      </w:r>
+      <w:r>
+        <w:t xml:space="preserve">230-station interactive CAAQMS map and composite Environmental Vulnerability Index (EVI) ranking table.</w:t>
+      </w:r>
+      <w:r>
+        <w:t xml:space="preserve"> </w:t>
+      </w:r>
+      <w:r>
+        <w:t xml:space="preserve">3.</w:t>
+      </w:r>
+      <w:r>
+        <w:t xml:space="preserve"> </w:t>
+      </w:r>
+      <w:r>
+        <w:rPr>
+          <w:i/>
+          <w:iCs/>
+        </w:rPr>
+        <w:t xml:space="preserve">Chemical Dynamics &amp; Volatility:</w:t>
+      </w:r>
+      <w:r>
+        <w:t xml:space="preserve"> </w:t>
+      </w:r>
+      <w:r>
+        <w:t xml:space="preserve">Stoichiometric particulate scatter plot with seasonal OLS regressions, correlation matrix, and 20-day Bollinger volatility bands.</w:t>
+      </w:r>
+      <w:r>
+        <w:t xml:space="preserve"> </w:t>
+      </w:r>
+      <w:r>
+        <w:t xml:space="preserve">4.</w:t>
+      </w:r>
+      <w:r>
+        <w:t xml:space="preserve"> </w:t>
+      </w:r>
+      <w:r>
+        <w:rPr>
+          <w:i/>
+          <w:iCs/>
+        </w:rPr>
+        <w:t xml:space="preserve">Statistical Models &amp; Forecasts:</w:t>
+      </w:r>
+      <w:r>
+        <w:t xml:space="preserve"> </w:t>
+      </w:r>
+      <w:r>
+        <w:t xml:space="preserve">Formal hypothesis testing badges and 30-day ARIMA predictive ribbons with 80% and 95% confidence bounds.</w:t>
+      </w:r>
+      <w:r>
+        <w:t xml:space="preserve"> </w:t>
+      </w:r>
+      <w:r>
+        <w:t xml:space="preserve">5.</w:t>
+      </w:r>
+      <w:r>
+        <w:t xml:space="preserve"> </w:t>
+      </w:r>
+      <w:r>
+        <w:rPr>
+          <w:i/>
+          <w:iCs/>
+        </w:rPr>
+        <w:t xml:space="preserve">Decision Support &amp; Relational SQL:</w:t>
+      </w:r>
+      <w:r>
+        <w:t xml:space="preserve"> </w:t>
+      </w:r>
+      <w:r>
+        <w:t xml:space="preserve">Graded Response Action Plan (GRAP Stages 0 to 4) matrix, text-mined advisory terms, and embedded SQLite star schema summary.</w:t>
+      </w:r>
+      <w:r>
+        <w:t xml:space="preserve"> </w:t>
+      </w:r>
+      <w:r>
+        <w:t xml:space="preserve">6.</w:t>
+      </w:r>
+      <w:r>
+        <w:t xml:space="preserve"> </w:t>
+      </w:r>
+      <w:r>
+        <w:rPr>
+          <w:i/>
+          <w:iCs/>
+        </w:rPr>
+        <w:t xml:space="preserve">About &amp; Rubrics Compliance:</w:t>
+      </w:r>
+      <w:r>
+        <w:t xml:space="preserve"> </w:t>
+      </w:r>
+      <w:r>
+        <w:t xml:space="preserve">Traceable mapping across all assessment criteria.</w:t>
+      </w:r>
+    </w:p>
     <w:bookmarkEnd w:id="123"/>
-    <w:bookmarkStart w:id="127" w:name="key-insights-and-societal-benefit"/>
+    <w:bookmarkEnd w:id="124"/>
+    <w:bookmarkStart w:id="128" w:name="key-insights-and-societal-benefit"/>
     <w:p>
       <w:pPr>
         <w:pStyle w:val="Heading1"/>
@@ -17938,7 +18241,7 @@
         <w:t xml:space="preserve">6. KEY INSIGHTS AND SOCIETAL BENEFIT</w:t>
       </w:r>
     </w:p>
-    <w:bookmarkStart w:id="124" w:name="core-scientific-findings"/>
+    <w:bookmarkStart w:id="125" w:name="core-scientific-findings"/>
     <w:p>
       <w:pPr>
         <w:pStyle w:val="Heading2"/>
@@ -18237,8 +18540,8 @@
         <w:t xml:space="preserve">Bollinger Bands successfully isolate post-monsoon stubble burning and festival fireworks events from chronic urban traffic baselines.</w:t>
       </w:r>
     </w:p>
-    <w:bookmarkEnd w:id="124"/>
-    <w:bookmarkStart w:id="125" w:name="stakeholder-impact-matrix"/>
+    <w:bookmarkEnd w:id="125"/>
+    <w:bookmarkStart w:id="126" w:name="stakeholder-impact-matrix"/>
     <w:p>
       <w:pPr>
         <w:pStyle w:val="Heading2"/>
@@ -18509,8 +18812,8 @@
         </w:tc>
       </w:tr>
     </w:tbl>
-    <w:bookmarkEnd w:id="125"/>
-    <w:bookmarkStart w:id="126" w:name="X9938ce2530db0e2346da31ccecfc0e67f7054bb"/>
+    <w:bookmarkEnd w:id="126"/>
+    <w:bookmarkStart w:id="127" w:name="X9938ce2530db0e2346da31ccecfc0e67f7054bb"/>
     <w:p>
       <w:pPr>
         <w:pStyle w:val="Heading2"/>
@@ -18564,9 +18867,9 @@
         <w:t xml:space="preserve">Transparently document historical boundaries (data ends July 2020) and encourage validation against live official portals for immediate daily precautions.</w:t>
       </w:r>
     </w:p>
-    <w:bookmarkEnd w:id="126"/>
     <w:bookmarkEnd w:id="127"/>
-    <w:bookmarkStart w:id="128" w:name="Xb43a05d91f5f7298ab45547c18f6717c0f54585"/>
+    <w:bookmarkEnd w:id="128"/>
+    <w:bookmarkStart w:id="129" w:name="Xb43a05d91f5f7298ab45547c18f6717c0f54585"/>
     <w:p>
       <w:pPr>
         <w:pStyle w:val="Heading1"/>
@@ -18837,8 +19140,8 @@
         </w:tc>
       </w:tr>
     </w:tbl>
-    <w:bookmarkEnd w:id="128"/>
-    <w:bookmarkStart w:id="131" w:name="conclusion-system-evaluation"/>
+    <w:bookmarkEnd w:id="129"/>
+    <w:bookmarkStart w:id="132" w:name="conclusion-system-evaluation"/>
     <w:p>
       <w:pPr>
         <w:pStyle w:val="Heading1"/>
@@ -18856,7 +19159,7 @@
         <w:t xml:space="preserve">8. CONCLUSION &amp; SYSTEM EVALUATION</w:t>
       </w:r>
     </w:p>
-    <w:bookmarkStart w:id="129" w:name="summary-of-project-outcomes"/>
+    <w:bookmarkStart w:id="130" w:name="summary-of-project-outcomes"/>
     <w:p>
       <w:pPr>
         <w:pStyle w:val="Heading2"/>
@@ -19089,8 +19392,8 @@
         <w:t xml:space="preserve">Delivered an objective Environmental Vulnerability Index (EVI) and automated Graded Response Action Plan (GRAP) decision-support matrix.</w:t>
       </w:r>
     </w:p>
-    <w:bookmarkEnd w:id="129"/>
-    <w:bookmarkStart w:id="130" w:name="overall-evaluation"/>
+    <w:bookmarkEnd w:id="130"/>
+    <w:bookmarkStart w:id="131" w:name="overall-evaluation"/>
     <w:p>
       <w:pPr>
         <w:pStyle w:val="Heading2"/>
@@ -19116,9 +19419,9 @@
         <w:t xml:space="preserve">The system establishes a transparent, reproducible benchmark for environmental analytics. By embedding data quality audits, outlier flags, and multi-grain reconciliation into the core code, AIRGUARD 360 bridges the gap between academic data science and real-world civic decision-making.</w:t>
       </w:r>
     </w:p>
-    <w:bookmarkEnd w:id="130"/>
     <w:bookmarkEnd w:id="131"/>
-    <w:bookmarkStart w:id="132" w:name="future-scope-roadmap"/>
+    <w:bookmarkEnd w:id="132"/>
+    <w:bookmarkStart w:id="133" w:name="future-scope-roadmap"/>
     <w:p>
       <w:pPr>
         <w:pStyle w:val="Heading1"/>
@@ -19412,8 +19715,8 @@
         </w:tc>
       </w:tr>
     </w:tbl>
-    <w:bookmarkEnd w:id="132"/>
-    <w:bookmarkStart w:id="135" w:name="references-bibliography"/>
+    <w:bookmarkEnd w:id="133"/>
+    <w:bookmarkStart w:id="136" w:name="references-bibliography"/>
     <w:p>
       <w:pPr>
         <w:pStyle w:val="Heading1"/>
@@ -19533,7 +19836,7 @@
       <w:r>
         <w:t xml:space="preserve"> </w:t>
       </w:r>
-      <w:hyperlink r:id="rId133">
+      <w:hyperlink r:id="rId134">
         <w:r>
           <w:rPr>
             <w:rStyle w:val="Hyperlink"/>
@@ -19700,7 +20003,7 @@
       <w:r>
         <w:t xml:space="preserve"> </w:t>
       </w:r>
-      <w:hyperlink r:id="rId134">
+      <w:hyperlink r:id="rId135">
         <w:r>
           <w:rPr>
             <w:rStyle w:val="Hyperlink"/>
@@ -19712,8 +20015,8 @@
         <w:t xml:space="preserve">.</w:t>
       </w:r>
     </w:p>
-    <w:bookmarkEnd w:id="135"/>
-    <w:bookmarkStart w:id="138" w:name="Xe8da9b43e1bf15377fd8ec349134dcad70f7b02"/>
+    <w:bookmarkEnd w:id="136"/>
+    <w:bookmarkStart w:id="139" w:name="Xe8da9b43e1bf15377fd8ec349134dcad70f7b02"/>
     <w:p>
       <w:pPr>
         <w:pStyle w:val="Heading1"/>
@@ -19731,7 +20034,7 @@
         <w:t xml:space="preserve">11. PROJECT RESOURCES, VERIFICATION SUITE &amp; RUN GUIDE</w:t>
       </w:r>
     </w:p>
-    <w:bookmarkStart w:id="136" w:name="file-manifest-in-submitted-bundle"/>
+    <w:bookmarkStart w:id="137" w:name="file-manifest-in-submitted-bundle"/>
     <w:p>
       <w:pPr>
         <w:pStyle w:val="Heading2"/>
@@ -19919,7 +20222,7 @@
         <w:rPr>
           <w:rStyle w:val="VerbatimChar"/>
         </w:rPr>
-        <w:t xml:space="preserve">│   └── figures/                 # 8 High-resolution publication-quality PNG charts</w:t>
+        <w:t xml:space="preserve">│   └── figures/                 # 9 High-resolution publication-quality PNG charts</w:t>
       </w:r>
       <w:r>
         <w:br/>
@@ -19955,7 +20258,7 @@
         <w:rPr>
           <w:rStyle w:val="VerbatimChar"/>
         </w:rPr>
-        <w:t xml:space="preserve">│   └── AIRGUARD_360_Project_Report.pdf  # Publication-grade PDF Report</w:t>
+        <w:t xml:space="preserve">│   ├── AIRGUARD_360_Project_Report.pdf  # Publication-grade PDF Report</w:t>
       </w:r>
       <w:r>
         <w:br/>
@@ -19964,6 +20267,24 @@
         <w:rPr>
           <w:rStyle w:val="VerbatimChar"/>
         </w:rPr>
+        <w:t xml:space="preserve">│   ├── AIRGUARD_360_Project_Report.html # Standalone interactive HTML report</w:t>
+      </w:r>
+      <w:r>
+        <w:br/>
+      </w:r>
+      <w:r>
+        <w:rPr>
+          <w:rStyle w:val="VerbatimChar"/>
+        </w:rPr>
+        <w:t xml:space="preserve">│   └── airguard_dashboard.html      # Compiled standalone R Markdown dashboard</w:t>
+      </w:r>
+      <w:r>
+        <w:br/>
+      </w:r>
+      <w:r>
+        <w:rPr>
+          <w:rStyle w:val="VerbatimChar"/>
+        </w:rPr>
         <w:t xml:space="preserve">├── tests/</w:t>
       </w:r>
       <w:r>
@@ -19982,7 +20303,7 @@
         <w:rPr>
           <w:rStyle w:val="VerbatimChar"/>
         </w:rPr>
-        <w:t xml:space="preserve">├── app.R                        # Interactive Shiny Dashboard (bslib + plotly)</w:t>
+        <w:t xml:space="preserve">├── app.R                        # Reactive Shiny Dashboard (bslib + plotly)</w:t>
       </w:r>
       <w:r>
         <w:br/>
@@ -19991,6 +20312,24 @@
         <w:rPr>
           <w:rStyle w:val="VerbatimChar"/>
         </w:rPr>
+        <w:t xml:space="preserve">├── dashboard.Rmd                # Standalone Interactive R Markdown Dashboard (flexdashboard)</w:t>
+      </w:r>
+      <w:r>
+        <w:br/>
+      </w:r>
+      <w:r>
+        <w:rPr>
+          <w:rStyle w:val="VerbatimChar"/>
+        </w:rPr>
+        <w:t xml:space="preserve">├── dashboard.html               # Compiled zero-server interactive HTML dashboard</w:t>
+      </w:r>
+      <w:r>
+        <w:br/>
+      </w:r>
+      <w:r>
+        <w:rPr>
+          <w:rStyle w:val="VerbatimChar"/>
+        </w:rPr>
         <w:t xml:space="preserve">├── run_pipeline.R               # Master end-to-end execution script</w:t>
       </w:r>
       <w:r>
@@ -20009,7 +20348,7 @@
         <w:rPr>
           <w:rStyle w:val="VerbatimChar"/>
         </w:rPr>
-        <w:t xml:space="preserve">├── README.md                    # Comprehensive enterprise documentation</w:t>
+        <w:t xml:space="preserve">├── VIVA_PREPARATION_GUIDE.md    # 30 Technical Viva questions, pitch &amp; cheat-sheet</w:t>
       </w:r>
       <w:r>
         <w:br/>
@@ -20018,11 +20357,29 @@
         <w:rPr>
           <w:rStyle w:val="VerbatimChar"/>
         </w:rPr>
+        <w:t xml:space="preserve">├── LINKEDIN_POST_KIT.md         # Viral post copy drafts, hashtags &amp; 24-hr growth strategy</w:t>
+      </w:r>
+      <w:r>
+        <w:br/>
+      </w:r>
+      <w:r>
+        <w:rPr>
+          <w:rStyle w:val="VerbatimChar"/>
+        </w:rPr>
+        <w:t xml:space="preserve">├── README.md                    # Comprehensive enterprise documentation &amp; rubrics matrix</w:t>
+      </w:r>
+      <w:r>
+        <w:br/>
+      </w:r>
+      <w:r>
+        <w:rPr>
+          <w:rStyle w:val="VerbatimChar"/>
+        </w:rPr>
         <w:t xml:space="preserve">└── .gitignore                   # Version control exclusions</w:t>
       </w:r>
     </w:p>
-    <w:bookmarkEnd w:id="136"/>
-    <w:bookmarkStart w:id="137" w:name="reproduction-execution-guide"/>
+    <w:bookmarkEnd w:id="137"/>
+    <w:bookmarkStart w:id="138" w:name="reproduction-execution-guide"/>
     <w:p>
       <w:pPr>
         <w:pStyle w:val="Heading2"/>
@@ -20277,9 +20634,9 @@
         <w:t xml:space="preserve">)</w:t>
       </w:r>
     </w:p>
-    <w:bookmarkEnd w:id="137"/>
     <w:bookmarkEnd w:id="138"/>
-    <w:bookmarkStart w:id="139" w:name="X57c6bd8855f1e8402cc00716a77b85b0e88f13e"/>
+    <w:bookmarkEnd w:id="139"/>
+    <w:bookmarkStart w:id="140" w:name="X57c6bd8855f1e8402cc00716a77b85b0e88f13e"/>
     <w:p>
       <w:pPr>
         <w:pStyle w:val="Heading1"/>
@@ -20864,7 +21221,7 @@
         </w:tc>
       </w:tr>
     </w:tbl>
-    <w:bookmarkEnd w:id="139"/>
+    <w:bookmarkEnd w:id="140"/>
     <w:sectPr>
       <w:footnotePr>
         <w:numRestart w:val="eachSect"/>

</xml_diff>

<commit_message>
chore: remove redundant dashboard duplicates from reports and clean temporary R session files
</commit_message>
<xml_diff>
--- a/reports/AIRGUARD_360_Project_Report.docx
+++ b/reports/AIRGUARD_360_Project_Report.docx
@@ -20267,16 +20267,7 @@
         <w:rPr>
           <w:rStyle w:val="VerbatimChar"/>
         </w:rPr>
-        <w:t xml:space="preserve">│   ├── AIRGUARD_360_Project_Report.html # Standalone interactive HTML report</w:t>
-      </w:r>
-      <w:r>
-        <w:br/>
-      </w:r>
-      <w:r>
-        <w:rPr>
-          <w:rStyle w:val="VerbatimChar"/>
-        </w:rPr>
-        <w:t xml:space="preserve">│   └── airguard_dashboard.html      # Compiled standalone R Markdown dashboard</w:t>
+        <w:t xml:space="preserve">│   └── AIRGUARD_360_Project_Report.html # Standalone interactive HTML report</w:t>
       </w:r>
       <w:r>
         <w:br/>

</xml_diff>

<commit_message>
chore: enhance pandoc auto-detection in pipeline and synchronize freshly compiled reports and dashboard
</commit_message>
<xml_diff>
--- a/reports/AIRGUARD_360_Project_Report.docx
+++ b/reports/AIRGUARD_360_Project_Report.docx
@@ -60,14 +60,15 @@
         </w:p>
       </w:sdtContent>
     </w:sdt>
-    <w:bookmarkStart w:id="9" w:name="cover-page"/>
     <w:p>
       <w:pPr>
         <w:pStyle w:val="Heading1"/>
       </w:pPr>
+      <w:bookmarkStart w:id="9" w:name="_85d59f7538c336ed36e054db9e3eba4ba1c83e5"/>
       <w:r>
         <w:t xml:space="preserve">COVER PAGE</w:t>
       </w:r>
+      <w:bookmarkEnd w:id="9"/>
     </w:p>
     <w:p>
       <w:pPr>
@@ -76,10 +77,18 @@
     </w:p>
     <w:p>
       <w:pPr>
+        <w:pStyle w:val="FirstParagraph"/>
+      </w:pPr>
+      <w:r>
+        <w:t xml:space="preserve">INT232: DATA SCIENCE TOOLBOX : R PROGRAMMING</w:t>
+      </w:r>
+    </w:p>
+    <w:p>
+      <w:pPr>
         <w:pStyle w:val="BodyText"/>
       </w:pPr>
       <w:r>
-        <w:t xml:space="preserve">INT232: DATA SCIENCE TOOLBOX : R PROGRAMMING</w:t>
+        <w:t xml:space="preserve">PROJECT REPORT</w:t>
       </w:r>
     </w:p>
     <w:p>
@@ -87,7 +96,7 @@
         <w:pStyle w:val="BodyText"/>
       </w:pPr>
       <w:r>
-        <w:t xml:space="preserve">PROJECT REPORT</w:t>
+        <w:t xml:space="preserve">(Project Semester: August-January 2026 / Academic Session 2025-2026)</w:t>
       </w:r>
     </w:p>
     <w:p>
@@ -95,7 +104,7 @@
         <w:pStyle w:val="BodyText"/>
       </w:pPr>
       <w:r>
-        <w:t xml:space="preserve">(Project Semester: August-January 2026 / Academic Session 2025-2026)</w:t>
+        <w:t xml:space="preserve">AIRGUARD 360</w:t>
       </w:r>
     </w:p>
     <w:p>
@@ -103,7 +112,7 @@
         <w:pStyle w:val="BodyText"/>
       </w:pPr>
       <w:r>
-        <w:t xml:space="preserve">AIRGUARD 360</w:t>
+        <w:t xml:space="preserve">An Interactive Air Quality Intelligence, Multi-Pollutant Analytics &amp; Environmental Decision-Support System</w:t>
       </w:r>
     </w:p>
     <w:p>
@@ -111,7 +120,7 @@
         <w:pStyle w:val="BodyText"/>
       </w:pPr>
       <w:r>
-        <w:t xml:space="preserve">An Interactive Air Quality Intelligence, Multi-Pollutant Analytics &amp; Environmental Decision-Support System</w:t>
+        <w:t xml:space="preserve">Discipline of Computer Science &amp; Engineering</w:t>
       </w:r>
     </w:p>
     <w:p>
@@ -119,7 +128,7 @@
         <w:pStyle w:val="BodyText"/>
       </w:pPr>
       <w:r>
-        <w:t xml:space="preserve">Discipline of Computer Science &amp; Engineering</w:t>
+        <w:t xml:space="preserve">Lovely School of Computer Science &amp; Engineering</w:t>
       </w:r>
     </w:p>
     <w:p>
@@ -127,7 +136,7 @@
         <w:pStyle w:val="BodyText"/>
       </w:pPr>
       <w:r>
-        <w:t xml:space="preserve">Lovely School of Computer Science &amp; Engineering</w:t>
+        <w:t xml:space="preserve">Lovely Professional University, Phagwara, Punjab</w:t>
       </w:r>
     </w:p>
     <w:p>
@@ -135,7 +144,7 @@
         <w:pStyle w:val="BodyText"/>
       </w:pPr>
       <w:r>
-        <w:t xml:space="preserve">Lovely Professional University, Phagwara, Punjab</w:t>
+        <w:t xml:space="preserve">Submitted by:</w:t>
       </w:r>
     </w:p>
     <w:p>
@@ -143,7 +152,7 @@
         <w:pStyle w:val="BodyText"/>
       </w:pPr>
       <w:r>
-        <w:t xml:space="preserve">Submitted by:</w:t>
+        <w:t xml:space="preserve">Name: Subrat Panigrahi</w:t>
       </w:r>
     </w:p>
     <w:p>
@@ -151,7 +160,7 @@
         <w:pStyle w:val="BodyText"/>
       </w:pPr>
       <w:r>
-        <w:t xml:space="preserve">Name: Subrat Panigrahi</w:t>
+        <w:t xml:space="preserve">Registration Number: 26143073</w:t>
       </w:r>
     </w:p>
     <w:p>
@@ -159,7 +168,7 @@
         <w:pStyle w:val="BodyText"/>
       </w:pPr>
       <w:r>
-        <w:t xml:space="preserve">Registration Number: 26143073</w:t>
+        <w:t xml:space="preserve">Programme: B.Tech Computer Science &amp; Engineering</w:t>
       </w:r>
     </w:p>
     <w:p>
@@ -167,28 +176,28 @@
         <w:pStyle w:val="BodyText"/>
       </w:pPr>
       <w:r>
-        <w:t xml:space="preserve">Programme: B.Tech Computer Science &amp; Engineering</w:t>
+        <w:t xml:space="preserve">Section: N1 | Course Code: INT232</w:t>
       </w:r>
     </w:p>
     <w:p>
       <w:pPr>
         <w:pStyle w:val="BodyText"/>
       </w:pPr>
-      <w:r>
-        <w:t xml:space="preserve">Section: N1 | Course Code: INT232</w:t>
-      </w:r>
     </w:p>
     <w:p>
       <w:pPr>
         <w:pStyle w:val="BodyText"/>
       </w:pPr>
+      <w:r>
+        <w:t xml:space="preserve">Under the Guidance of:</w:t>
+      </w:r>
     </w:p>
     <w:p>
       <w:pPr>
         <w:pStyle w:val="BodyText"/>
       </w:pPr>
       <w:r>
-        <w:t xml:space="preserve">Under the Guidance of:</w:t>
+        <w:t xml:space="preserve">Mr. Jaffar Amin Chacket (30453)</w:t>
       </w:r>
     </w:p>
     <w:p>
@@ -196,7 +205,7 @@
         <w:pStyle w:val="BodyText"/>
       </w:pPr>
       <w:r>
-        <w:t xml:space="preserve">Mr. Jaffar Amin Chacket (30453)</w:t>
+        <w:t xml:space="preserve">Associate Professor, Lovely School of Computer Science &amp; Engineering</w:t>
       </w:r>
     </w:p>
     <w:p>
@@ -204,14 +213,6 @@
         <w:pStyle w:val="BodyText"/>
       </w:pPr>
       <w:r>
-        <w:t xml:space="preserve">Associate Professor, Lovely School of Computer Science &amp; Engineering</w:t>
-      </w:r>
-    </w:p>
-    <w:p>
-      <w:pPr>
-        <w:pStyle w:val="BodyText"/>
-      </w:pPr>
-      <w:r>
         <w:t xml:space="preserve">GitHub Project Repository:</w:t>
       </w:r>
       <w:r>
@@ -221,15 +222,15 @@
         <w:t xml:space="preserve">https://github.com/Subu2006/AIRGUARD-360</w:t>
       </w:r>
     </w:p>
-    <w:bookmarkEnd w:id="9"/>
-    <w:bookmarkStart w:id="10" w:name="certificate"/>
     <w:p>
       <w:pPr>
         <w:pStyle w:val="Heading1"/>
       </w:pPr>
+      <w:bookmarkStart w:id="10" w:name="_certificate"/>
       <w:r>
         <w:t xml:space="preserve">CERTIFICATE</w:t>
       </w:r>
+      <w:bookmarkEnd w:id="10"/>
     </w:p>
     <w:p>
       <w:pPr>
@@ -437,15 +438,15 @@
         <w:t xml:space="preserve">24/10/2026</w:t>
       </w:r>
     </w:p>
-    <w:bookmarkEnd w:id="10"/>
-    <w:bookmarkStart w:id="11" w:name="declaration"/>
     <w:p>
       <w:pPr>
         <w:pStyle w:val="Heading1"/>
       </w:pPr>
+      <w:bookmarkStart w:id="11" w:name="_declaration"/>
       <w:r>
         <w:t xml:space="preserve">DECLARATION</w:t>
       </w:r>
+      <w:bookmarkEnd w:id="11"/>
     </w:p>
     <w:p>
       <w:pPr>
@@ -624,15 +625,15 @@
         <w:t xml:space="preserve">Subrat Panigrahi</w:t>
       </w:r>
     </w:p>
-    <w:bookmarkEnd w:id="11"/>
-    <w:bookmarkStart w:id="12" w:name="acknowledgement"/>
     <w:p>
       <w:pPr>
         <w:pStyle w:val="Heading1"/>
       </w:pPr>
+      <w:bookmarkStart w:id="12" w:name="_acknowledgement"/>
       <w:r>
         <w:t xml:space="preserve">ACKNOWLEDGEMENT</w:t>
       </w:r>
+      <w:bookmarkEnd w:id="12"/>
     </w:p>
     <w:p>
       <w:pPr>
@@ -846,15 +847,15 @@
         <w:t xml:space="preserve">Finally, I convey my sincere thanks to my family, peers, and fellow researchers for their unwavering encouragement, patience, and support throughout this endeavor.</w:t>
       </w:r>
     </w:p>
-    <w:bookmarkEnd w:id="12"/>
-    <w:bookmarkStart w:id="14" w:name="executive-summary"/>
     <w:p>
       <w:pPr>
         <w:pStyle w:val="Heading1"/>
       </w:pPr>
+      <w:bookmarkStart w:id="13" w:name="_24178e17815d7ed05207769f6e2fdf5de730a75"/>
       <w:r>
         <w:t xml:space="preserve">EXECUTIVE SUMMARY</w:t>
       </w:r>
+      <w:bookmarkEnd w:id="13"/>
     </w:p>
     <w:p>
       <w:pPr>
@@ -1237,11 +1238,11 @@
         </w:tc>
       </w:tr>
     </w:tbl>
-    <w:bookmarkStart w:id="13" w:name="core-problems-addressed-by-the-system"/>
     <w:p>
       <w:pPr>
         <w:pStyle w:val="Heading3"/>
       </w:pPr>
+      <w:bookmarkStart w:id="14" w:name="_154a336e8c41c255b7d0d7875656d0d894418bf"/>
       <w:r>
         <w:rPr>
           <w:rStyle w:val="SectionNumber"/>
@@ -1254,6 +1255,7 @@
       <w:r>
         <w:t xml:space="preserve">Core Problems Addressed by the System:</w:t>
       </w:r>
+      <w:bookmarkEnd w:id="14"/>
     </w:p>
     <w:p>
       <w:pPr>
@@ -1570,13 +1572,11 @@
         <w:t xml:space="preserve">, Plotly, and dynamic station coordinate mapping across India.</w:t>
       </w:r>
     </w:p>
-    <w:bookmarkEnd w:id="13"/>
-    <w:bookmarkEnd w:id="14"/>
-    <w:bookmarkStart w:id="21" w:name="introduction"/>
     <w:p>
       <w:pPr>
         <w:pStyle w:val="Heading1"/>
       </w:pPr>
+      <w:bookmarkStart w:id="15" w:name="_introduction"/>
       <w:r>
         <w:rPr>
           <w:rStyle w:val="SectionNumber"/>
@@ -1589,12 +1589,13 @@
       <w:r>
         <w:t xml:space="preserve">1. INTRODUCTION</w:t>
       </w:r>
-    </w:p>
-    <w:bookmarkStart w:id="15" w:name="project-background"/>
+      <w:bookmarkEnd w:id="15"/>
+    </w:p>
     <w:p>
       <w:pPr>
         <w:pStyle w:val="Heading2"/>
       </w:pPr>
+      <w:bookmarkStart w:id="16" w:name="_dbc4d444f9fdde25c84a45a3bb9e7fdec1b6fac"/>
       <w:r>
         <w:rPr>
           <w:rStyle w:val="SectionNumber"/>
@@ -1607,6 +1608,7 @@
       <w:r>
         <w:t xml:space="preserve">1.1 Project Background</w:t>
       </w:r>
+      <w:bookmarkEnd w:id="16"/>
     </w:p>
     <w:p>
       <w:pPr>
@@ -1624,12 +1626,11 @@
         <w:t xml:space="preserve">The Central Pollution Control Board (CPCB), Ministry of Environment, Forest and Climate Change (MoEFCC), operates a nationwide network of Continuous Ambient Air Quality Monitoring Stations (CAAQMS). While massive volumes of telemetry are captured daily, raw tabular files remain fragmented, dense, and inaccessible to non-technical policymakers, researchers, and citizens. Translating raw statutory records into accessible, scientifically defensible intelligence requires robust data science workflows.</w:t>
       </w:r>
     </w:p>
-    <w:bookmarkEnd w:id="15"/>
-    <w:bookmarkStart w:id="16" w:name="problem-statement"/>
     <w:p>
       <w:pPr>
         <w:pStyle w:val="Heading2"/>
       </w:pPr>
+      <w:bookmarkStart w:id="17" w:name="_80405804e065f2c789b9d50555f9bde4550fee8"/>
       <w:r>
         <w:rPr>
           <w:rStyle w:val="SectionNumber"/>
@@ -1642,6 +1643,7 @@
       <w:r>
         <w:t xml:space="preserve">1.2 Problem Statement</w:t>
       </w:r>
+      <w:bookmarkEnd w:id="17"/>
     </w:p>
     <w:p>
       <w:pPr>
@@ -1739,12 +1741,11 @@
         <w:t xml:space="preserve">Observers frequently infer causal blame (e.g., traffic vs agriculture) from single-pollutant charts without considering atmospheric chemistry, boundary layer height, or wind trajectories.</w:t>
       </w:r>
     </w:p>
-    <w:bookmarkEnd w:id="16"/>
-    <w:bookmarkStart w:id="17" w:name="proposed-system-architecture"/>
     <w:p>
       <w:pPr>
         <w:pStyle w:val="Heading2"/>
       </w:pPr>
+      <w:bookmarkStart w:id="18" w:name="_37c8e46a0bbf8bbe2d6574203ec12f76f555c92"/>
       <w:r>
         <w:rPr>
           <w:rStyle w:val="SectionNumber"/>
@@ -1757,6 +1758,7 @@
       <w:r>
         <w:t xml:space="preserve">1.3 Proposed System Architecture</w:t>
       </w:r>
+      <w:bookmarkEnd w:id="18"/>
     </w:p>
     <w:p>
       <w:pPr>
@@ -1957,12 +1959,11 @@
         <w:t xml:space="preserve">+-----------------------------------------------------------------------------------+</w:t>
       </w:r>
     </w:p>
-    <w:bookmarkEnd w:id="17"/>
-    <w:bookmarkStart w:id="18" w:name="core-analytical-questions"/>
     <w:p>
       <w:pPr>
         <w:pStyle w:val="Heading2"/>
       </w:pPr>
+      <w:bookmarkStart w:id="19" w:name="_20ad8c8f0cc95b5784b32017686f76de61c5721"/>
       <w:r>
         <w:rPr>
           <w:rStyle w:val="SectionNumber"/>
@@ -1975,6 +1976,7 @@
       <w:r>
         <w:t xml:space="preserve">1.4 Core Analytical Questions</w:t>
       </w:r>
+      <w:bookmarkEnd w:id="19"/>
     </w:p>
     <w:p>
       <w:pPr>
@@ -2066,12 +2068,11 @@
         <w:t xml:space="preserve">7. How can multi-criteria risk scoring (Environmental Vulnerability Index) prioritize municipal mitigation under the Graded Response Action Plan (GRAP)?</w:t>
       </w:r>
     </w:p>
-    <w:bookmarkEnd w:id="18"/>
-    <w:bookmarkStart w:id="19" w:name="methodology-at-a-glance"/>
     <w:p>
       <w:pPr>
         <w:pStyle w:val="Heading2"/>
       </w:pPr>
+      <w:bookmarkStart w:id="20" w:name="_08ece17f09423ccf5854c411be3a3067a1c5c3e"/>
       <w:r>
         <w:rPr>
           <w:rStyle w:val="SectionNumber"/>
@@ -2084,6 +2085,7 @@
       <w:r>
         <w:t xml:space="preserve">1.5 Methodology at a Glance</w:t>
       </w:r>
+      <w:bookmarkEnd w:id="20"/>
     </w:p>
     <w:p>
       <w:pPr>
@@ -2295,12 +2297,11 @@
         <w:t xml:space="preserve">).</w:t>
       </w:r>
     </w:p>
-    <w:bookmarkEnd w:id="19"/>
-    <w:bookmarkStart w:id="20" w:name="practical-success-criteria"/>
     <w:p>
       <w:pPr>
         <w:pStyle w:val="Heading2"/>
       </w:pPr>
+      <w:bookmarkStart w:id="21" w:name="_fb8ae3da8df47131ec71ae9f64af710aa168f38"/>
       <w:r>
         <w:rPr>
           <w:rStyle w:val="SectionNumber"/>
@@ -2313,6 +2314,7 @@
       <w:r>
         <w:t xml:space="preserve">1.6 Practical Success Criteria</w:t>
       </w:r>
+      <w:bookmarkEnd w:id="21"/>
     </w:p>
     <w:p>
       <w:pPr>
@@ -2429,13 +2431,11 @@
         <w:t xml:space="preserve">Sensor anomalies (&gt; 500 AQI) and missing observations are visibly flagged with transparent caveats rather than hidden.</w:t>
       </w:r>
     </w:p>
-    <w:bookmarkEnd w:id="20"/>
-    <w:bookmarkEnd w:id="21"/>
-    <w:bookmarkStart w:id="27" w:name="source-of-dataset-data-architecture"/>
     <w:p>
       <w:pPr>
         <w:pStyle w:val="Heading1"/>
       </w:pPr>
+      <w:bookmarkStart w:id="22" w:name="_f9bc7abbc887c97564d121c3d33a276c9b7dc4d"/>
       <w:r>
         <w:rPr>
           <w:rStyle w:val="SectionNumber"/>
@@ -2448,12 +2448,13 @@
       <w:r>
         <w:t xml:space="preserve">2. SOURCE OF DATASET &amp; DATA ARCHITECTURE</w:t>
       </w:r>
-    </w:p>
-    <w:bookmarkStart w:id="22" w:name="statutory-data-provenance"/>
+      <w:bookmarkEnd w:id="22"/>
+    </w:p>
     <w:p>
       <w:pPr>
         <w:pStyle w:val="Heading2"/>
       </w:pPr>
+      <w:bookmarkStart w:id="23" w:name="_37dd81747f2d88496f91ca2699aaac198f2d595"/>
       <w:r>
         <w:rPr>
           <w:rStyle w:val="SectionNumber"/>
@@ -2466,6 +2467,7 @@
       <w:r>
         <w:t xml:space="preserve">2.1 Statutory Data Provenance</w:t>
       </w:r>
+      <w:bookmarkEnd w:id="23"/>
     </w:p>
     <w:p>
       <w:pPr>
@@ -2851,12 +2853,11 @@
         </w:tc>
       </w:tr>
     </w:tbl>
-    <w:bookmarkEnd w:id="22"/>
-    <w:bookmarkStart w:id="23" w:name="Xec8afea26cf1c6f965cc7cea077c9b031346d7d"/>
     <w:p>
       <w:pPr>
         <w:pStyle w:val="Heading2"/>
       </w:pPr>
+      <w:bookmarkStart w:id="24" w:name="_ec8afea26cf1c6f965cc7cea077c9b031346d7d"/>
       <w:r>
         <w:rPr>
           <w:rStyle w:val="SectionNumber"/>
@@ -2869,6 +2870,7 @@
       <w:r>
         <w:t xml:space="preserve">2.2 Dataset Schema &amp; Multi-Grain Data Foundation</w:t>
       </w:r>
+      <w:bookmarkEnd w:id="24"/>
     </w:p>
     <w:p>
       <w:pPr>
@@ -2974,12 +2976,11 @@
         <w:t xml:space="preserve">Multiple stations belong to a single city. Direct joins between city and station fact tables without aggregation would create severe Cartesian row multiplication, distorting counts and averages.</w:t>
       </w:r>
     </w:p>
-    <w:bookmarkEnd w:id="23"/>
-    <w:bookmarkStart w:id="24" w:name="X7968f91928e847457b115c4a5ab9e360ac08b2b"/>
     <w:p>
       <w:pPr>
         <w:pStyle w:val="Heading2"/>
       </w:pPr>
+      <w:bookmarkStart w:id="25" w:name="_7968f91928e847457b115c4a5ab9e360ac08b2b"/>
       <w:r>
         <w:rPr>
           <w:rStyle w:val="SectionNumber"/>
@@ -2992,6 +2993,7 @@
       <w:r>
         <w:t xml:space="preserve">2.3 Station Catalogue &amp; Geographical Coordinates</w:t>
       </w:r>
+      <w:bookmarkEnd w:id="25"/>
     </w:p>
     <w:p>
       <w:pPr>
@@ -3043,7 +3045,6 @@
         <m:r>
           <m:rPr>
             <m:nor/>
-            <m:sty m:val="p"/>
           </m:rPr>
           <m:t>N</m:t>
         </m:r>
@@ -3076,7 +3077,6 @@
         <m:r>
           <m:rPr>
             <m:nor/>
-            <m:sty m:val="p"/>
           </m:rPr>
           <m:t>N</m:t>
         </m:r>
@@ -3115,7 +3115,6 @@
         <m:r>
           <m:rPr>
             <m:nor/>
-            <m:sty m:val="p"/>
           </m:rPr>
           <m:t>E</m:t>
         </m:r>
@@ -3148,7 +3147,6 @@
         <m:r>
           <m:rPr>
             <m:nor/>
-            <m:sty m:val="p"/>
           </m:rPr>
           <m:t>E</m:t>
         </m:r>
@@ -3187,12 +3185,11 @@
         <w:t xml:space="preserve">).</w:t>
       </w:r>
     </w:p>
-    <w:bookmarkEnd w:id="24"/>
-    <w:bookmarkStart w:id="25" w:name="X51c08643a98e5562c5464f36ac2a8cd6bec5ab5"/>
     <w:p>
       <w:pPr>
         <w:pStyle w:val="Heading2"/>
       </w:pPr>
+      <w:bookmarkStart w:id="26" w:name="_51c08643a98e5562c5464f36ac2a8cd6bec5ab5"/>
       <w:r>
         <w:rPr>
           <w:rStyle w:val="SectionNumber"/>
@@ -3205,6 +3202,7 @@
       <w:r>
         <w:t xml:space="preserve">2.4 Embedded Relational Database Architecture</w:t>
       </w:r>
+      <w:bookmarkEnd w:id="26"/>
     </w:p>
     <w:p>
       <w:pPr>
@@ -4354,12 +4352,11 @@
         </w:tc>
       </w:tr>
     </w:tbl>
-    <w:bookmarkEnd w:id="25"/>
-    <w:bookmarkStart w:id="26" w:name="data-quality-audit-record-reconciliation"/>
     <w:p>
       <w:pPr>
         <w:pStyle w:val="Heading2"/>
       </w:pPr>
+      <w:bookmarkStart w:id="27" w:name="_0a6a3e4988da9a8dc2a8dfca8407cacca455d69"/>
       <w:r>
         <w:rPr>
           <w:rStyle w:val="SectionNumber"/>
@@ -4372,6 +4369,7 @@
       <w:r>
         <w:t xml:space="preserve">2.5 Data Quality Audit &amp; Record Reconciliation</w:t>
       </w:r>
+      <w:bookmarkEnd w:id="27"/>
     </w:p>
     <w:p>
       <w:pPr>
@@ -4577,13 +4575,11 @@
         <w:t xml:space="preserve">Incomplete records are preserved rather than deleted. A record with missing PM10 may still contain pristine PM2.5, NO2, and SO2 data. Denominators for pollutant averages dynamically reflect valid non-missing observations.</w:t>
       </w:r>
     </w:p>
-    <w:bookmarkEnd w:id="26"/>
-    <w:bookmarkEnd w:id="27"/>
-    <w:bookmarkStart w:id="35" w:name="eda-process-data-engineering"/>
     <w:p>
       <w:pPr>
         <w:pStyle w:val="Heading1"/>
       </w:pPr>
+      <w:bookmarkStart w:id="28" w:name="_fed263db7a57ca26cedd07a699a53f8c7fc5411"/>
       <w:r>
         <w:rPr>
           <w:rStyle w:val="SectionNumber"/>
@@ -4596,12 +4592,13 @@
       <w:r>
         <w:t xml:space="preserve">3. EDA PROCESS &amp; DATA ENGINEERING</w:t>
       </w:r>
-    </w:p>
-    <w:bookmarkStart w:id="28" w:name="X69ff2988da2d500c6a1ac2ae5860306633b40fd"/>
+      <w:bookmarkEnd w:id="28"/>
+    </w:p>
     <w:p>
       <w:pPr>
         <w:pStyle w:val="Heading2"/>
       </w:pPr>
+      <w:bookmarkStart w:id="29" w:name="_69ff2988da2d500c6a1ac2ae5860306633b40fd"/>
       <w:r>
         <w:rPr>
           <w:rStyle w:val="SectionNumber"/>
@@ -4614,6 +4611,7 @@
       <w:r>
         <w:t xml:space="preserve">3.1 Systematic Data Cleaning &amp; Physical Sanity Validations</w:t>
       </w:r>
+      <w:bookmarkEnd w:id="29"/>
     </w:p>
     <w:p>
       <w:pPr>
@@ -4772,12 +4770,11 @@
         <w:t xml:space="preserve">and regular expressions.</w:t>
       </w:r>
     </w:p>
-    <w:bookmarkEnd w:id="28"/>
-    <w:bookmarkStart w:id="29" w:name="X5599fba7b3365fef00690c26bcff76ddd1cd24b"/>
     <w:p>
       <w:pPr>
         <w:pStyle w:val="Heading2"/>
       </w:pPr>
+      <w:bookmarkStart w:id="30" w:name="_5599fba7b3365fef00690c26bcff76ddd1cd24b"/>
       <w:r>
         <w:rPr>
           <w:rStyle w:val="SectionNumber"/>
@@ -4790,6 +4787,7 @@
       <w:r>
         <w:t xml:space="preserve">3.2 Categorical Factor Encoding &amp; Severity Ranks</w:t>
       </w:r>
+      <w:bookmarkEnd w:id="30"/>
     </w:p>
     <w:p>
       <w:pPr>
@@ -4811,7 +4809,6 @@
         <m:r>
           <m:rPr>
             <m:nor/>
-            <m:sty m:val="p"/>
           </m:rPr>
           <m:t>Good</m:t>
         </m:r>
@@ -4824,7 +4821,6 @@
         <m:r>
           <m:rPr>
             <m:nor/>
-            <m:sty m:val="p"/>
           </m:rPr>
           <m:t>Satisfactory</m:t>
         </m:r>
@@ -4837,7 +4833,6 @@
         <m:r>
           <m:rPr>
             <m:nor/>
-            <m:sty m:val="p"/>
           </m:rPr>
           <m:t>Moderate</m:t>
         </m:r>
@@ -4850,7 +4845,6 @@
         <m:r>
           <m:rPr>
             <m:nor/>
-            <m:sty m:val="p"/>
           </m:rPr>
           <m:t>Poor</m:t>
         </m:r>
@@ -4863,7 +4857,6 @@
         <m:r>
           <m:rPr>
             <m:nor/>
-            <m:sty m:val="p"/>
           </m:rPr>
           <m:t>Very Poor</m:t>
         </m:r>
@@ -4876,7 +4869,6 @@
         <m:r>
           <m:rPr>
             <m:nor/>
-            <m:sty m:val="p"/>
           </m:rPr>
           <m:t>Severe</m:t>
         </m:r>
@@ -4977,7 +4969,6 @@
           <m:r>
             <m:rPr>
               <m:nor/>
-              <m:sty m:val="p"/>
             </m:rPr>
             <m:t>AQI Bucket</m:t>
           </m:r>
@@ -5002,14 +4993,14 @@
                   <m:mcs>
                     <m:mc>
                       <m:mcPr>
+                        <m:count m:val="1"/>
                         <m:mcJc m:val="left"/>
-                        <m:count m:val="1"/>
                       </m:mcPr>
                     </m:mc>
                     <m:mc>
                       <m:mcPr>
+                        <m:count m:val="1"/>
                         <m:mcJc m:val="left"/>
-                        <m:count m:val="1"/>
                       </m:mcPr>
                     </m:mc>
                   </m:mcs>
@@ -5019,7 +5010,6 @@
                     <m:r>
                       <m:rPr>
                         <m:nor/>
-                        <m:sty m:val="p"/>
                       </m:rPr>
                       <m:t>Good</m:t>
                     </m:r>
@@ -5037,7 +5027,6 @@
                     <m:r>
                       <m:rPr>
                         <m:nor/>
-                        <m:sty m:val="p"/>
                       </m:rPr>
                       <m:t>AQI</m:t>
                     </m:r>
@@ -5057,7 +5046,6 @@
                     <m:r>
                       <m:rPr>
                         <m:nor/>
-                        <m:sty m:val="p"/>
                       </m:rPr>
                       <m:t>Satisfactory</m:t>
                     </m:r>
@@ -5075,7 +5063,6 @@
                     <m:r>
                       <m:rPr>
                         <m:nor/>
-                        <m:sty m:val="p"/>
                       </m:rPr>
                       <m:t>AQI</m:t>
                     </m:r>
@@ -5095,7 +5082,6 @@
                     <m:r>
                       <m:rPr>
                         <m:nor/>
-                        <m:sty m:val="p"/>
                       </m:rPr>
                       <m:t>Moderate</m:t>
                     </m:r>
@@ -5113,7 +5099,6 @@
                     <m:r>
                       <m:rPr>
                         <m:nor/>
-                        <m:sty m:val="p"/>
                       </m:rPr>
                       <m:t>AQI</m:t>
                     </m:r>
@@ -5133,7 +5118,6 @@
                     <m:r>
                       <m:rPr>
                         <m:nor/>
-                        <m:sty m:val="p"/>
                       </m:rPr>
                       <m:t>Poor</m:t>
                     </m:r>
@@ -5151,7 +5135,6 @@
                     <m:r>
                       <m:rPr>
                         <m:nor/>
-                        <m:sty m:val="p"/>
                       </m:rPr>
                       <m:t>AQI</m:t>
                     </m:r>
@@ -5171,7 +5154,6 @@
                     <m:r>
                       <m:rPr>
                         <m:nor/>
-                        <m:sty m:val="p"/>
                       </m:rPr>
                       <m:t>Very Poor</m:t>
                     </m:r>
@@ -5189,7 +5171,6 @@
                     <m:r>
                       <m:rPr>
                         <m:nor/>
-                        <m:sty m:val="p"/>
                       </m:rPr>
                       <m:t>AQI</m:t>
                     </m:r>
@@ -5209,7 +5190,6 @@
                     <m:r>
                       <m:rPr>
                         <m:nor/>
-                        <m:sty m:val="p"/>
                       </m:rPr>
                       <m:t>Severe</m:t>
                     </m:r>
@@ -5218,7 +5198,6 @@
                     <m:r>
                       <m:rPr>
                         <m:nor/>
-                        <m:sty m:val="p"/>
                       </m:rPr>
                       <m:t>AQI</m:t>
                     </m:r>
@@ -5239,12 +5218,11 @@
         </m:oMath>
       </m:oMathPara>
     </w:p>
-    <w:bookmarkEnd w:id="29"/>
-    <w:bookmarkStart w:id="30" w:name="handling-extreme-outliers-500-aqi-scale"/>
     <w:p>
       <w:pPr>
         <w:pStyle w:val="Heading2"/>
       </w:pPr>
+      <w:bookmarkStart w:id="31" w:name="_1b52c0260764cc7ca8fbf6947395f0ce161a17b"/>
       <w:r>
         <w:rPr>
           <w:rStyle w:val="SectionNumber"/>
@@ -5257,6 +5235,7 @@
       <w:r>
         <w:t xml:space="preserve">3.3 Handling Extreme Outliers (&gt; 500 AQI Scale)</w:t>
       </w:r>
+      <w:bookmarkEnd w:id="31"/>
     </w:p>
     <w:p>
       <w:pPr>
@@ -5358,12 +5337,11 @@
         <w:t xml:space="preserve">. In dashboard KPI summaries, medians and trimmed means are reported alongside arithmetic means to ensure robust reporting.</w:t>
       </w:r>
     </w:p>
-    <w:bookmarkEnd w:id="30"/>
-    <w:bookmarkStart w:id="31" w:name="climatological-season-classification"/>
     <w:p>
       <w:pPr>
         <w:pStyle w:val="Heading2"/>
       </w:pPr>
+      <w:bookmarkStart w:id="32" w:name="_4c57aa43edec36f468ce98f258bc1f1211ce143"/>
       <w:r>
         <w:rPr>
           <w:rStyle w:val="SectionNumber"/>
@@ -5376,6 +5354,7 @@
       <w:r>
         <w:t xml:space="preserve">3.4 Climatological Season Classification</w:t>
       </w:r>
+      <w:bookmarkEnd w:id="32"/>
     </w:p>
     <w:p>
       <w:pPr>
@@ -5419,7 +5398,6 @@
         <m:r>
           <m:rPr>
             <m:nor/>
-            <m:sty m:val="p"/>
           </m:rPr>
           <m:t> m</m:t>
         </m:r>
@@ -5471,7 +5449,6 @@
         <m:r>
           <m:rPr>
             <m:nor/>
-            <m:sty m:val="p"/>
           </m:rPr>
           <m:t> m</m:t>
         </m:r>
@@ -5524,12 +5501,11 @@
         <w:t xml:space="preserve">Rapid boundary layer compression, atmospheric stagnation, and widespread agricultural crop residue combustion across north-western states.</w:t>
       </w:r>
     </w:p>
-    <w:bookmarkEnd w:id="31"/>
-    <w:bookmarkStart w:id="32" w:name="multi-pollutant-moving-average-smoothers"/>
     <w:p>
       <w:pPr>
         <w:pStyle w:val="Heading2"/>
       </w:pPr>
+      <w:bookmarkStart w:id="33" w:name="_abc0bcd07cba8e3f60de4a194bc4764e1ad42fd"/>
       <w:r>
         <w:rPr>
           <w:rStyle w:val="SectionNumber"/>
@@ -5542,6 +5518,7 @@
       <w:r>
         <w:t xml:space="preserve">3.5 Multi-Pollutant Moving Average Smoothers</w:t>
       </w:r>
+      <w:bookmarkEnd w:id="33"/>
     </w:p>
     <w:p>
       <w:pPr>
@@ -5711,7 +5688,6 @@
           <m:r>
             <m:rPr>
               <m:nor/>
-              <m:sty m:val="p"/>
             </m:rPr>
             <m:t> is not NA</m:t>
           </m:r>
@@ -5816,12 +5792,11 @@
         <w:t xml:space="preserve">).</w:t>
       </w:r>
     </w:p>
-    <w:bookmarkEnd w:id="32"/>
-    <w:bookmarkStart w:id="33" w:name="volatility-modeling-via-bollinger-bands"/>
     <w:p>
       <w:pPr>
         <w:pStyle w:val="Heading2"/>
       </w:pPr>
+      <w:bookmarkStart w:id="34" w:name="_45e4c47dc15843b66de65227799f74da827f070"/>
       <w:r>
         <w:rPr>
           <w:rStyle w:val="SectionNumber"/>
@@ -5834,6 +5809,7 @@
       <w:r>
         <w:t xml:space="preserve">3.6 Volatility Modeling via Bollinger Bands</w:t>
       </w:r>
+      <w:bookmarkEnd w:id="34"/>
     </w:p>
     <w:p>
       <w:pPr>
@@ -5918,7 +5894,6 @@
             <m:r>
               <m:rPr>
                 <m:nor/>
-                <m:sty m:val="p"/>
               </m:rPr>
               <m:t>UB</m:t>
             </m:r>
@@ -6021,7 +5996,6 @@
             <m:r>
               <m:rPr>
                 <m:nor/>
-                <m:sty m:val="p"/>
               </m:rPr>
               <m:t>LB</m:t>
             </m:r>
@@ -6182,7 +6156,6 @@
             <m:r>
               <m:rPr>
                 <m:nor/>
-                <m:sty m:val="p"/>
               </m:rPr>
               <m:t>UB</m:t>
             </m:r>
@@ -6227,12 +6200,11 @@
         <w:t xml:space="preserve">upper ceiling represent statistically abnormal pollution shocks (e.g., crop residue burning episodes or post-Diwali pyrotechnic bursts) rather than standard urban baseline emissions.</w:t>
       </w:r>
     </w:p>
-    <w:bookmarkEnd w:id="33"/>
-    <w:bookmarkStart w:id="34" w:name="comprehensive-summary-statistics"/>
     <w:p>
       <w:pPr>
         <w:pStyle w:val="Heading2"/>
       </w:pPr>
+      <w:bookmarkStart w:id="35" w:name="_b5fd57b4c7c63285fea5ba964493b8f367a3211"/>
       <w:r>
         <w:rPr>
           <w:rStyle w:val="SectionNumber"/>
@@ -6245,6 +6217,7 @@
       <w:r>
         <w:t xml:space="preserve">3.7 Comprehensive Summary Statistics</w:t>
       </w:r>
+      <w:bookmarkEnd w:id="35"/>
     </w:p>
     <w:p>
       <w:pPr>
@@ -7275,13 +7248,11 @@
         </w:tc>
       </w:tr>
     </w:tbl>
-    <w:bookmarkEnd w:id="34"/>
-    <w:bookmarkEnd w:id="35"/>
-    <w:bookmarkStart w:id="120" w:name="analysis-on-dataset"/>
     <w:p>
       <w:pPr>
         <w:pStyle w:val="Heading1"/>
       </w:pPr>
+      <w:bookmarkStart w:id="36" w:name="_595a53b3ce5e25991c123b4a4a1ac2081d3825c"/>
       <w:r>
         <w:rPr>
           <w:rStyle w:val="SectionNumber"/>
@@ -7294,12 +7265,13 @@
       <w:r>
         <w:t xml:space="preserve">4. ANALYSIS ON DATASET</w:t>
       </w:r>
-    </w:p>
-    <w:bookmarkStart w:id="44" w:name="Xa60a3d5fb31e9849dcb6147cceadd40f8d33fb3"/>
+      <w:bookmarkEnd w:id="36"/>
+    </w:p>
     <w:p>
       <w:pPr>
         <w:pStyle w:val="Heading2"/>
       </w:pPr>
+      <w:bookmarkStart w:id="37" w:name="_a60a3d5fb31e9849dcb6147cceadd40f8d33fb3"/>
       <w:r>
         <w:rPr>
           <w:rStyle w:val="SectionNumber"/>
@@ -7312,12 +7284,13 @@
       <w:r>
         <w:t xml:space="preserve">4.1 National Air Quality &amp; Metropolitan Hotspots Analysis</w:t>
       </w:r>
-    </w:p>
-    <w:bookmarkStart w:id="36" w:name="i.-introduction"/>
+      <w:bookmarkEnd w:id="37"/>
+    </w:p>
     <w:p>
       <w:pPr>
         <w:pStyle w:val="Heading3"/>
       </w:pPr>
+      <w:bookmarkStart w:id="38" w:name="_f990d51b53e36c17355a6666bd6589b8aa26857"/>
       <w:r>
         <w:rPr>
           <w:rStyle w:val="SectionNumber"/>
@@ -7330,6 +7303,7 @@
       <w:r>
         <w:t xml:space="preserve">i. Introduction</w:t>
       </w:r>
+      <w:bookmarkEnd w:id="38"/>
     </w:p>
     <w:p>
       <w:pPr>
@@ -7339,12 +7313,11 @@
         <w:t xml:space="preserve">Quantifying the baseline severity of ambient air pollution across India’s urban network is vital for establishing national environmental benchmarks, tracking compliance with National Ambient Air Quality Standards (NAAQS), and identifying the most vulnerable population centers.</w:t>
       </w:r>
     </w:p>
-    <w:bookmarkEnd w:id="36"/>
-    <w:bookmarkStart w:id="37" w:name="ii.-general-description"/>
     <w:p>
       <w:pPr>
         <w:pStyle w:val="Heading3"/>
       </w:pPr>
+      <w:bookmarkStart w:id="39" w:name="_b7c6da260acbf06bb0b4533207c2f2a85f4d047"/>
       <w:r>
         <w:rPr>
           <w:rStyle w:val="SectionNumber"/>
@@ -7357,6 +7330,7 @@
       <w:r>
         <w:t xml:space="preserve">ii. General Description</w:t>
       </w:r>
+      <w:bookmarkEnd w:id="39"/>
     </w:p>
     <w:p>
       <w:pPr>
@@ -7366,12 +7340,11 @@
         <w:t xml:space="preserve">This analysis computes national-level parametric and non-parametric summary metrics across all 26 monitored metropolitan cities, evaluates city-level average AQI levels, and generates comparative rankings to identify high-risk urban hotspots.</w:t>
       </w:r>
     </w:p>
-    <w:bookmarkEnd w:id="37"/>
-    <w:bookmarkStart w:id="38" w:name="X94ab6ef210e253bbf437da73379b2271af9317a"/>
     <w:p>
       <w:pPr>
         <w:pStyle w:val="Heading3"/>
       </w:pPr>
+      <w:bookmarkStart w:id="40" w:name="_94ab6ef210e253bbf437da73379b2271af9317a"/>
       <w:r>
         <w:rPr>
           <w:rStyle w:val="SectionNumber"/>
@@ -7384,6 +7357,7 @@
       <w:r>
         <w:t xml:space="preserve">iii. Specific Requirements, Functions and Formulas</w:t>
       </w:r>
+      <w:bookmarkEnd w:id="40"/>
     </w:p>
     <w:p>
       <w:pPr>
@@ -7420,7 +7394,6 @@
                   <m:r>
                     <m:rPr>
                       <m:nor/>
-                      <m:sty m:val="p"/>
                     </m:rPr>
                     <m:t>AQI</m:t>
                   </m:r>
@@ -7504,7 +7477,6 @@
                   <m:r>
                     <m:rPr>
                       <m:nor/>
-                      <m:sty m:val="p"/>
                     </m:rPr>
                     <m:t>AQI</m:t>
                   </m:r>
@@ -7541,7 +7513,6 @@
           <m:r>
             <m:rPr>
               <m:nor/>
-              <m:sty m:val="p"/>
             </m:rPr>
             <m:t>Severe Day Proportion </m:t>
           </m:r>
@@ -7555,7 +7526,6 @@
               <m:r>
                 <m:rPr>
                   <m:nor/>
-                  <m:sty m:val="p"/>
                 </m:rPr>
                 <m:t>sev</m:t>
               </m:r>
@@ -7637,7 +7607,6 @@
                   <m:r>
                     <m:rPr>
                       <m:nor/>
-                      <m:sty m:val="p"/>
                     </m:rPr>
                     <m:t>AQI</m:t>
                   </m:r>
@@ -7776,12 +7745,11 @@
         <w:t xml:space="preserve">.</w:t>
       </w:r>
     </w:p>
-    <w:bookmarkEnd w:id="38"/>
-    <w:bookmarkStart w:id="39" w:name="iv.-analysis-results"/>
     <w:p>
       <w:pPr>
         <w:pStyle w:val="Heading3"/>
       </w:pPr>
+      <w:bookmarkStart w:id="41" w:name="_3096289582a7a6fe9243689e6fc1af71cf3fb00"/>
       <w:r>
         <w:rPr>
           <w:rStyle w:val="SectionNumber"/>
@@ -7794,6 +7762,7 @@
       <w:r>
         <w:t xml:space="preserve">iv. Analysis Results</w:t>
       </w:r>
+      <w:bookmarkEnd w:id="41"/>
     </w:p>
     <w:p>
       <w:pPr>
@@ -7942,12 +7911,11 @@
         <w:t xml:space="preserve">In stark contrast, coastal and southern cities exhibit substantially cleaner air: Thiruvananthapuram, Kerala (78.5), Shillong, Meghalaya (75.3), Bengaluru, Karnataka (96.4), and Visakhapatnam, Andhra Pradesh (120.8).</w:t>
       </w:r>
     </w:p>
-    <w:bookmarkEnd w:id="39"/>
-    <w:bookmarkStart w:id="43" w:name="v.-visualization"/>
     <w:p>
       <w:pPr>
         <w:pStyle w:val="Heading3"/>
       </w:pPr>
+      <w:bookmarkStart w:id="42" w:name="_1c06ad02bd884d8a14d33e1f83baccfaac2a902"/>
       <w:r>
         <w:rPr>
           <w:rStyle w:val="SectionNumber"/>
@@ -7960,6 +7928,7 @@
       <w:r>
         <w:t xml:space="preserve">v. Visualization</w:t>
       </w:r>
+      <w:bookmarkEnd w:id="42"/>
     </w:p>
     <w:p>
       <w:pPr>
@@ -7970,18 +7939,18 @@
           <wp:inline>
             <wp:extent cx="4800600" cy="3000375"/>
             <wp:effectExtent b="0" l="0" r="0" t="0"/>
-            <wp:docPr descr="Figure 2: Top 10 High-Risk Air Pollution Hotspots in India Ranked by Mean AQI" title="" id="41" name="Picture"/>
+            <wp:docPr descr="Figure 2: Top 10 High-Risk Air Pollution Hotspots in India Ranked by Mean AQI" title="" id="44" name="Picture"/>
             <a:graphic>
               <a:graphicData uri="http://schemas.openxmlformats.org/drawingml/2006/picture">
                 <pic:pic>
                   <pic:nvPicPr>
-                    <pic:cNvPr descr="../outputs/figures/fig2_hotspots_ranking.png" id="42" name="Picture"/>
+                    <pic:cNvPr descr="../outputs/figures/fig2_hotspots_ranking.png" id="45" name="Picture"/>
                     <pic:cNvPicPr>
                       <a:picLocks noChangeArrowheads="1" noChangeAspect="1"/>
                     </pic:cNvPicPr>
                   </pic:nvPicPr>
                   <pic:blipFill>
-                    <a:blip r:embed="rId40"/>
+                    <a:blip r:embed="rId43"/>
                     <a:stretch>
                       <a:fillRect/>
                     </a:stretch>
@@ -8023,13 +7992,11 @@
         </w:pict>
       </w:r>
     </w:p>
-    <w:bookmarkEnd w:id="43"/>
-    <w:bookmarkEnd w:id="44"/>
-    <w:bookmarkStart w:id="56" w:name="Xe974661b7efc30a37d23ac3fe08c204ee1c555f"/>
     <w:p>
       <w:pPr>
         <w:pStyle w:val="Heading2"/>
       </w:pPr>
+      <w:bookmarkStart w:id="46" w:name="_e974661b7efc30a37d23ac3fe08c204ee1c555f"/>
       <w:r>
         <w:rPr>
           <w:rStyle w:val="SectionNumber"/>
@@ -8042,12 +8009,13 @@
       <w:r>
         <w:t xml:space="preserve">4.2 Temporal Dynamics, Multi-Year Trends &amp; Seasonal Inversion Analysis</w:t>
       </w:r>
-    </w:p>
-    <w:bookmarkStart w:id="45" w:name="i.-introduction-1"/>
+      <w:bookmarkEnd w:id="46"/>
+    </w:p>
     <w:p>
       <w:pPr>
         <w:pStyle w:val="Heading3"/>
       </w:pPr>
+      <w:bookmarkStart w:id="47" w:name="_d52090e6ee8691b5c8e73cf2cde6f538daced2a"/>
       <w:r>
         <w:rPr>
           <w:rStyle w:val="SectionNumber"/>
@@ -8060,6 +8028,7 @@
       <w:r>
         <w:t xml:space="preserve">i. Introduction</w:t>
       </w:r>
+      <w:bookmarkEnd w:id="47"/>
     </w:p>
     <w:p>
       <w:pPr>
@@ -8069,12 +8038,11 @@
         <w:t xml:space="preserve">Air pollution in India is characterized by severe seasonal oscillations. Identifying temporal trend lines, multi-year progression, and recurring seasonal cycles is critical for timing regulatory interventions.</w:t>
       </w:r>
     </w:p>
-    <w:bookmarkEnd w:id="45"/>
-    <w:bookmarkStart w:id="46" w:name="ii.-general-description-1"/>
     <w:p>
       <w:pPr>
         <w:pStyle w:val="Heading3"/>
       </w:pPr>
+      <w:bookmarkStart w:id="48" w:name="_6c81c22de8636c95ab196dc474911ef5507e837"/>
       <w:r>
         <w:rPr>
           <w:rStyle w:val="SectionNumber"/>
@@ -8087,6 +8055,7 @@
       <w:r>
         <w:t xml:space="preserve">ii. General Description</w:t>
       </w:r>
+      <w:bookmarkEnd w:id="48"/>
     </w:p>
     <w:p>
       <w:pPr>
@@ -8096,12 +8065,11 @@
         <w:t xml:space="preserve">This analysis examines temporal trends from 2015 to 2020, decomposes monthly concentration curves, and assesses seasonal differences between winter thermal inversions and monsoon wet deposition.</w:t>
       </w:r>
     </w:p>
-    <w:bookmarkEnd w:id="46"/>
-    <w:bookmarkStart w:id="47" w:name="Xecf005ca56433d9f74fe45e0ace93be0f9198f2"/>
     <w:p>
       <w:pPr>
         <w:pStyle w:val="Heading3"/>
       </w:pPr>
+      <w:bookmarkStart w:id="49" w:name="_ecf005ca56433d9f74fe45e0ace93be0f9198f2"/>
       <w:r>
         <w:rPr>
           <w:rStyle w:val="SectionNumber"/>
@@ -8114,6 +8082,7 @@
       <w:r>
         <w:t xml:space="preserve">iii. Specific Requirements, Functions and Formulas</w:t>
       </w:r>
+      <w:bookmarkEnd w:id="49"/>
     </w:p>
     <w:p>
       <w:pPr>
@@ -8143,7 +8112,6 @@
           <m:r>
             <m:rPr>
               <m:nor/>
-              <m:sty m:val="p"/>
             </m:rPr>
             <m:t>YoY Change </m:t>
           </m:r>
@@ -8189,7 +8157,6 @@
                       <m:r>
                         <m:rPr>
                           <m:nor/>
-                          <m:sty m:val="p"/>
                         </m:rPr>
                         <m:t>current</m:t>
                       </m:r>
@@ -8218,7 +8185,6 @@
                       <m:r>
                         <m:rPr>
                           <m:nor/>
-                          <m:sty m:val="p"/>
                         </m:rPr>
                         <m:t>prior</m:t>
                       </m:r>
@@ -8243,7 +8209,6 @@
                       <m:r>
                         <m:rPr>
                           <m:nor/>
-                          <m:sty m:val="p"/>
                         </m:rPr>
                         <m:t>prior</m:t>
                       </m:r>
@@ -8341,12 +8306,11 @@
         <w:t xml:space="preserve">.</w:t>
       </w:r>
     </w:p>
-    <w:bookmarkEnd w:id="47"/>
-    <w:bookmarkStart w:id="48" w:name="iv.-analysis-results-1"/>
     <w:p>
       <w:pPr>
         <w:pStyle w:val="Heading3"/>
       </w:pPr>
+      <w:bookmarkStart w:id="50" w:name="_c83d11a3b3b607859e5947bbbe08793cde08b87"/>
       <w:r>
         <w:rPr>
           <w:rStyle w:val="SectionNumber"/>
@@ -8359,6 +8323,7 @@
       <w:r>
         <w:t xml:space="preserve">iv. Analysis Results</w:t>
       </w:r>
+      <w:bookmarkEnd w:id="50"/>
     </w:p>
     <w:p>
       <w:pPr>
@@ -8417,7 +8382,6 @@
             <m:r>
               <m:rPr>
                 <m:nor/>
-                <m:sty m:val="p"/>
               </m:rPr>
               <m:t>g/m</m:t>
             </m:r>
@@ -8490,12 +8454,11 @@
         <w:t xml:space="preserve">National annual average AQI displayed a gradual downward trajectory from 187.5 in 2015 to 114.3 in 2020, punctuated by an episodic rebound in 2018. However, the 2020 figure represents partial-year coverage (January to July) and was heavily influenced by the nationwide COVID-19 lockdown (March–May 2020).</w:t>
       </w:r>
     </w:p>
-    <w:bookmarkEnd w:id="48"/>
-    <w:bookmarkStart w:id="55" w:name="v.-visualization-1"/>
     <w:p>
       <w:pPr>
         <w:pStyle w:val="Heading3"/>
       </w:pPr>
+      <w:bookmarkStart w:id="51" w:name="_60cff4a1340822139248a85435a2fb45a89823a"/>
       <w:r>
         <w:rPr>
           <w:rStyle w:val="SectionNumber"/>
@@ -8508,6 +8471,7 @@
       <w:r>
         <w:t xml:space="preserve">v. Visualization</w:t>
       </w:r>
+      <w:bookmarkEnd w:id="51"/>
     </w:p>
     <w:p>
       <w:pPr>
@@ -8516,20 +8480,20 @@
       <w:r>
         <w:drawing>
           <wp:inline>
-            <wp:extent cx="4800600" cy="2667000"/>
+            <wp:extent cx="4800600" cy="2666999"/>
             <wp:effectExtent b="0" l="0" r="0" t="0"/>
-            <wp:docPr descr="Figure 1: Multi-Year Continuous Temporal Trajectory and 7-Day Moving Average for Delhi" title="" id="50" name="Picture"/>
+            <wp:docPr descr="Figure 1: Multi-Year Continuous Temporal Trajectory and 7-Day Moving Average for Delhi" title="" id="53" name="Picture"/>
             <a:graphic>
               <a:graphicData uri="http://schemas.openxmlformats.org/drawingml/2006/picture">
                 <pic:pic>
                   <pic:nvPicPr>
-                    <pic:cNvPr descr="../outputs/figures/fig1_temporal_trajectory_delhi.png" id="51" name="Picture"/>
+                    <pic:cNvPr descr="../outputs/figures/fig1_temporal_trajectory_delhi.png" id="54" name="Picture"/>
                     <pic:cNvPicPr>
                       <a:picLocks noChangeArrowheads="1" noChangeAspect="1"/>
                     </pic:cNvPicPr>
                   </pic:nvPicPr>
                   <pic:blipFill>
-                    <a:blip r:embed="rId49"/>
+                    <a:blip r:embed="rId52"/>
                     <a:stretch>
                       <a:fillRect/>
                     </a:stretch>
@@ -8537,7 +8501,7 @@
                   <pic:spPr bwMode="auto">
                     <a:xfrm>
                       <a:off x="0" y="0"/>
-                      <a:ext cx="4800600" cy="2667000"/>
+                      <a:ext cx="4800600" cy="2666999"/>
                     </a:xfrm>
                     <a:prstGeom prst="rect">
                       <a:avLst/>
@@ -8573,18 +8537,18 @@
           <wp:inline>
             <wp:extent cx="4800600" cy="2823882"/>
             <wp:effectExtent b="0" l="0" r="0" t="0"/>
-            <wp:docPr descr="Figure 8: Seasonal PM2.5 Concentration Disparity Across Monitored Indian Cities" title="" id="53" name="Picture"/>
+            <wp:docPr descr="Figure 8: Seasonal PM2.5 Concentration Disparity Across Monitored Indian Cities" title="" id="56" name="Picture"/>
             <a:graphic>
               <a:graphicData uri="http://schemas.openxmlformats.org/drawingml/2006/picture">
                 <pic:pic>
                   <pic:nvPicPr>
-                    <pic:cNvPr descr="../outputs/figures/fig8_seasonal_pollution_disparity.png" id="54" name="Picture"/>
+                    <pic:cNvPr descr="../outputs/figures/fig8_seasonal_pollution_disparity.png" id="57" name="Picture"/>
                     <pic:cNvPicPr>
                       <a:picLocks noChangeArrowheads="1" noChangeAspect="1"/>
                     </pic:cNvPicPr>
                   </pic:nvPicPr>
                   <pic:blipFill>
-                    <a:blip r:embed="rId52"/>
+                    <a:blip r:embed="rId55"/>
                     <a:stretch>
                       <a:fillRect/>
                     </a:stretch>
@@ -8626,13 +8590,11 @@
         </w:pict>
       </w:r>
     </w:p>
-    <w:bookmarkEnd w:id="55"/>
-    <w:bookmarkEnd w:id="56"/>
-    <w:bookmarkStart w:id="68" w:name="X749f7ff009d3247a934fd85b989e4ce08da88a9"/>
     <w:p>
       <w:pPr>
         <w:pStyle w:val="Heading2"/>
       </w:pPr>
+      <w:bookmarkStart w:id="58" w:name="_749f7ff009d3247a934fd85b989e4ce08da88a9"/>
       <w:r>
         <w:rPr>
           <w:rStyle w:val="SectionNumber"/>
@@ -8645,12 +8607,13 @@
       <w:r>
         <w:t xml:space="preserve">4.3 Multi-Pollutant Stoichiometry &amp; Chemical Collinearity Intelligence</w:t>
       </w:r>
-    </w:p>
-    <w:bookmarkStart w:id="57" w:name="i.-introduction-2"/>
+      <w:bookmarkEnd w:id="58"/>
+    </w:p>
     <w:p>
       <w:pPr>
         <w:pStyle w:val="Heading3"/>
       </w:pPr>
+      <w:bookmarkStart w:id="59" w:name="_b6d96360c0e2a1703dfe522d6af0a4644b3b038"/>
       <w:r>
         <w:rPr>
           <w:rStyle w:val="SectionNumber"/>
@@ -8663,6 +8626,7 @@
       <w:r>
         <w:t xml:space="preserve">i. Introduction</w:t>
       </w:r>
+      <w:bookmarkEnd w:id="59"/>
     </w:p>
     <w:p>
       <w:pPr>
@@ -8765,12 +8729,11 @@
         <w:t xml:space="preserve">) correlate provides vital insights into shared emission sources and atmospheric chemistry.</w:t>
       </w:r>
     </w:p>
-    <w:bookmarkEnd w:id="57"/>
-    <w:bookmarkStart w:id="58" w:name="ii.-general-description-2"/>
     <w:p>
       <w:pPr>
         <w:pStyle w:val="Heading3"/>
       </w:pPr>
+      <w:bookmarkStart w:id="60" w:name="_eddcb1afbedb6d3e8629477cf57b926ea856bb7"/>
       <w:r>
         <w:rPr>
           <w:rStyle w:val="SectionNumber"/>
@@ -8783,6 +8746,7 @@
       <w:r>
         <w:t xml:space="preserve">ii. General Description</w:t>
       </w:r>
+      <w:bookmarkEnd w:id="60"/>
     </w:p>
     <w:p>
       <w:pPr>
@@ -8841,12 +8805,11 @@
         <w:t xml:space="preserve">, and fits ordinary least squares (OLS) linear regressions across seasons.</w:t>
       </w:r>
     </w:p>
-    <w:bookmarkEnd w:id="58"/>
-    <w:bookmarkStart w:id="59" w:name="X68fba7e934ed03c95d91c83cb4cb3c475c3a81c"/>
     <w:p>
       <w:pPr>
         <w:pStyle w:val="Heading3"/>
       </w:pPr>
+      <w:bookmarkStart w:id="61" w:name="_68fba7e934ed03c95d91c83cb4cb3c475c3a81c"/>
       <w:r>
         <w:rPr>
           <w:rStyle w:val="SectionNumber"/>
@@ -8859,6 +8822,7 @@
       <w:r>
         <w:t xml:space="preserve">iii. Specific Requirements, Functions and Formulas</w:t>
       </w:r>
+      <w:bookmarkEnd w:id="61"/>
     </w:p>
     <w:p>
       <w:pPr>
@@ -9140,7 +9104,6 @@
           <m:r>
             <m:rPr>
               <m:nor/>
-              <m:sty m:val="p"/>
             </m:rPr>
             <m:t>OLS Model: </m:t>
           </m:r>
@@ -9316,12 +9279,11 @@
         <w:t xml:space="preserve">.</w:t>
       </w:r>
     </w:p>
-    <w:bookmarkEnd w:id="59"/>
-    <w:bookmarkStart w:id="60" w:name="iv.-analysis-results-2"/>
     <w:p>
       <w:pPr>
         <w:pStyle w:val="Heading3"/>
       </w:pPr>
+      <w:bookmarkStart w:id="62" w:name="_702d79111065fea882ef7b874a51ded63136454"/>
       <w:r>
         <w:rPr>
           <w:rStyle w:val="SectionNumber"/>
@@ -9334,6 +9296,7 @@
       <w:r>
         <w:t xml:space="preserve">iv. Analysis Results</w:t>
       </w:r>
+      <w:bookmarkEnd w:id="62"/>
     </w:p>
     <w:p>
       <w:pPr>
@@ -9797,12 +9760,11 @@
         <w:t xml:space="preserve">) reflects secondary sulfate aerosol formation, where gaseous sulfur dioxide emitted by thermal power plants oxidizes into fine ammonium sulfate particulates.</w:t>
       </w:r>
     </w:p>
-    <w:bookmarkEnd w:id="60"/>
-    <w:bookmarkStart w:id="67" w:name="v.-visualization-2"/>
     <w:p>
       <w:pPr>
         <w:pStyle w:val="Heading3"/>
       </w:pPr>
+      <w:bookmarkStart w:id="63" w:name="_479c14650bbdeac35ccc9ddaf9d2816fa7a6569"/>
       <w:r>
         <w:rPr>
           <w:rStyle w:val="SectionNumber"/>
@@ -9815,6 +9777,7 @@
       <w:r>
         <w:t xml:space="preserve">v. Visualization</w:t>
       </w:r>
+      <w:bookmarkEnd w:id="63"/>
     </w:p>
     <w:p>
       <w:pPr>
@@ -9825,18 +9788,18 @@
           <wp:inline>
             <wp:extent cx="4800600" cy="3300412"/>
             <wp:effectExtent b="0" l="0" r="0" t="0"/>
-            <wp:docPr descr="Figure 3: Particulate Stoichiometry Scatter Plot with Fitted OLS Regression Across Seasons in Delhi" title="" id="62" name="Picture"/>
+            <wp:docPr descr="Figure 3: Particulate Stoichiometry Scatter Plot with Fitted OLS Regression Across Seasons in Delhi" title="" id="65" name="Picture"/>
             <a:graphic>
               <a:graphicData uri="http://schemas.openxmlformats.org/drawingml/2006/picture">
                 <pic:pic>
                   <pic:nvPicPr>
-                    <pic:cNvPr descr="../outputs/figures/fig3_stoichiometry_scatter.png" id="63" name="Picture"/>
+                    <pic:cNvPr descr="../outputs/figures/fig3_stoichiometry_scatter.png" id="66" name="Picture"/>
                     <pic:cNvPicPr>
                       <a:picLocks noChangeArrowheads="1" noChangeAspect="1"/>
                     </pic:cNvPicPr>
                   </pic:nvPicPr>
                   <pic:blipFill>
-                    <a:blip r:embed="rId61"/>
+                    <a:blip r:embed="rId64"/>
                     <a:stretch>
                       <a:fillRect/>
                     </a:stretch>
@@ -9880,18 +9843,18 @@
           <wp:inline>
             <wp:extent cx="4800600" cy="3840479"/>
             <wp:effectExtent b="0" l="0" r="0" t="0"/>
-            <wp:docPr descr="Figure 4: Multi-Pollutant Pearson Correlation Heatmap across Criteria Ambient Pollutants" title="" id="65" name="Picture"/>
+            <wp:docPr descr="Figure 4: Multi-Pollutant Pearson Correlation Heatmap across Criteria Ambient Pollutants" title="" id="68" name="Picture"/>
             <a:graphic>
               <a:graphicData uri="http://schemas.openxmlformats.org/drawingml/2006/picture">
                 <pic:pic>
                   <pic:nvPicPr>
-                    <pic:cNvPr descr="../outputs/figures/fig4_correlation_heatmap.png" id="66" name="Picture"/>
+                    <pic:cNvPr descr="../outputs/figures/fig4_correlation_heatmap.png" id="69" name="Picture"/>
                     <pic:cNvPicPr>
                       <a:picLocks noChangeArrowheads="1" noChangeAspect="1"/>
                     </pic:cNvPicPr>
                   </pic:nvPicPr>
                   <pic:blipFill>
-                    <a:blip r:embed="rId64"/>
+                    <a:blip r:embed="rId67"/>
                     <a:stretch>
                       <a:fillRect/>
                     </a:stretch>
@@ -9933,13 +9896,11 @@
         </w:pict>
       </w:r>
     </w:p>
-    <w:bookmarkEnd w:id="67"/>
-    <w:bookmarkEnd w:id="68"/>
-    <w:bookmarkStart w:id="77" w:name="X661d5afdbd0a5cc83fe3826c6a3e47eaa9aad1f"/>
     <w:p>
       <w:pPr>
         <w:pStyle w:val="Heading2"/>
       </w:pPr>
+      <w:bookmarkStart w:id="70" w:name="_661d5afdbd0a5cc83fe3826c6a3e47eaa9aad1f"/>
       <w:r>
         <w:rPr>
           <w:rStyle w:val="SectionNumber"/>
@@ -9952,12 +9913,13 @@
       <w:r>
         <w:t xml:space="preserve">4.4 Episodic Surges &amp; Anomaly Volatility Detection via Bollinger Bands</w:t>
       </w:r>
-    </w:p>
-    <w:bookmarkStart w:id="69" w:name="i.-introduction-3"/>
+      <w:bookmarkEnd w:id="70"/>
+    </w:p>
     <w:p>
       <w:pPr>
         <w:pStyle w:val="Heading3"/>
       </w:pPr>
+      <w:bookmarkStart w:id="71" w:name="_7163f4fc1f54d16d0bd8a8d3f0e3fc2d8423e1c"/>
       <w:r>
         <w:rPr>
           <w:rStyle w:val="SectionNumber"/>
@@ -9970,6 +9932,7 @@
       <w:r>
         <w:t xml:space="preserve">i. Introduction</w:t>
       </w:r>
+      <w:bookmarkEnd w:id="71"/>
     </w:p>
     <w:p>
       <w:pPr>
@@ -9979,12 +9942,11 @@
         <w:t xml:space="preserve">Urban air quality exhibits acute spikes caused by transient external shocks (such as festival firecrackers or agricultural stubble combustion). Disentangling structural baseline shifts from short-term episodic volatility is essential for emergency governance.</w:t>
       </w:r>
     </w:p>
-    <w:bookmarkEnd w:id="69"/>
-    <w:bookmarkStart w:id="70" w:name="ii.-general-description-3"/>
     <w:p>
       <w:pPr>
         <w:pStyle w:val="Heading3"/>
       </w:pPr>
+      <w:bookmarkStart w:id="72" w:name="_188007f1ded0c42979bec021a2015a3846e1aee"/>
       <w:r>
         <w:rPr>
           <w:rStyle w:val="SectionNumber"/>
@@ -9997,6 +9959,7 @@
       <w:r>
         <w:t xml:space="preserve">ii. General Description</w:t>
       </w:r>
+      <w:bookmarkEnd w:id="72"/>
     </w:p>
     <w:p>
       <w:pPr>
@@ -10023,12 +9986,11 @@
         <w:t xml:space="preserve">) around ambient PM2.5 time series to flag statistical volatility breaches.</w:t>
       </w:r>
     </w:p>
-    <w:bookmarkEnd w:id="70"/>
-    <w:bookmarkStart w:id="71" w:name="X0253e1add89841e09f76ef115b317ea5e0d87bf"/>
     <w:p>
       <w:pPr>
         <w:pStyle w:val="Heading3"/>
       </w:pPr>
+      <w:bookmarkStart w:id="73" w:name="_0253e1add89841e09f76ef115b317ea5e0d87bf"/>
       <w:r>
         <w:rPr>
           <w:rStyle w:val="SectionNumber"/>
@@ -10041,6 +10003,7 @@
       <w:r>
         <w:t xml:space="preserve">iii. Specific Requirements, Functions and Formulas</w:t>
       </w:r>
+      <w:bookmarkEnd w:id="73"/>
     </w:p>
     <w:p>
       <w:pPr>
@@ -10331,7 +10294,6 @@
           <m:r>
             <m:rPr>
               <m:nor/>
-              <m:sty m:val="p"/>
             </m:rPr>
             <m:t>Upper Band </m:t>
           </m:r>
@@ -10340,7 +10302,6 @@
               <m:r>
                 <m:rPr>
                   <m:nor/>
-                  <m:sty m:val="p"/>
                 </m:rPr>
                 <m:t>UB</m:t>
               </m:r>
@@ -10420,7 +10381,6 @@
           <m:r>
             <m:rPr>
               <m:nor/>
-              <m:sty m:val="p"/>
             </m:rPr>
             <m:t>Lower Band </m:t>
           </m:r>
@@ -10429,7 +10389,6 @@
               <m:r>
                 <m:rPr>
                   <m:nor/>
-                  <m:sty m:val="p"/>
                 </m:rPr>
                 <m:t>LB</m:t>
               </m:r>
@@ -10609,12 +10568,11 @@
         <w:t xml:space="preserve">.</w:t>
       </w:r>
     </w:p>
-    <w:bookmarkEnd w:id="71"/>
-    <w:bookmarkStart w:id="72" w:name="iv.-analysis-results-3"/>
     <w:p>
       <w:pPr>
         <w:pStyle w:val="Heading3"/>
       </w:pPr>
+      <w:bookmarkStart w:id="74" w:name="_b30e671c3719ea010598af19173967974f23c65"/>
       <w:r>
         <w:rPr>
           <w:rStyle w:val="SectionNumber"/>
@@ -10627,6 +10585,7 @@
       <w:r>
         <w:t xml:space="preserve">iv. Analysis Results</w:t>
       </w:r>
+      <w:bookmarkEnd w:id="74"/>
     </w:p>
     <w:p>
       <w:pPr>
@@ -10661,7 +10620,6 @@
         <m:r>
           <m:rPr>
             <m:nor/>
-            <m:sty m:val="p"/>
           </m:rPr>
           <m:t>UB</m:t>
         </m:r>
@@ -10674,7 +10632,6 @@
         <m:r>
           <m:rPr>
             <m:nor/>
-            <m:sty m:val="p"/>
           </m:rPr>
           <m:t>LB</m:t>
         </m:r>
@@ -10698,7 +10655,6 @@
             <m:r>
               <m:rPr>
                 <m:nor/>
-                <m:sty m:val="p"/>
               </m:rPr>
               <m:t>g/m</m:t>
             </m:r>
@@ -10776,7 +10732,6 @@
             <m:r>
               <m:rPr>
                 <m:nor/>
-                <m:sty m:val="p"/>
               </m:rPr>
               <m:t>g/m</m:t>
             </m:r>
@@ -10792,12 +10747,11 @@
         <w:t xml:space="preserve">. The Bollinger anomaly detector successfully flags these occurrences as statistical shocks rather than gradual seasonal trends.</w:t>
       </w:r>
     </w:p>
-    <w:bookmarkEnd w:id="72"/>
-    <w:bookmarkStart w:id="76" w:name="v.-visualization-3"/>
     <w:p>
       <w:pPr>
         <w:pStyle w:val="Heading3"/>
       </w:pPr>
+      <w:bookmarkStart w:id="75" w:name="_f87eccfd3bff2e1ee4cdd85c0b74d42b393cb86"/>
       <w:r>
         <w:rPr>
           <w:rStyle w:val="SectionNumber"/>
@@ -10810,6 +10764,7 @@
       <w:r>
         <w:t xml:space="preserve">v. Visualization</w:t>
       </w:r>
+      <w:bookmarkEnd w:id="75"/>
     </w:p>
     <w:p>
       <w:pPr>
@@ -10820,18 +10775,18 @@
           <wp:inline>
             <wp:extent cx="4800600" cy="2526631"/>
             <wp:effectExtent b="0" l="0" r="0" t="0"/>
-            <wp:docPr descr="Figure 5: 20-Day Bollinger Volatility Bands and Acute Episodic Surge Markers on Ambient PM2.5" title="" id="74" name="Picture"/>
+            <wp:docPr descr="Figure 5: 20-Day Bollinger Volatility Bands and Acute Episodic Surge Markers on Ambient PM2.5" title="" id="77" name="Picture"/>
             <a:graphic>
               <a:graphicData uri="http://schemas.openxmlformats.org/drawingml/2006/picture">
                 <pic:pic>
                   <pic:nvPicPr>
-                    <pic:cNvPr descr="../outputs/figures/fig5_bollinger_volatility_bands.png" id="75" name="Picture"/>
+                    <pic:cNvPr descr="../outputs/figures/fig5_bollinger_volatility_bands.png" id="78" name="Picture"/>
                     <pic:cNvPicPr>
                       <a:picLocks noChangeArrowheads="1" noChangeAspect="1"/>
                     </pic:cNvPicPr>
                   </pic:nvPicPr>
                   <pic:blipFill>
-                    <a:blip r:embed="rId73"/>
+                    <a:blip r:embed="rId76"/>
                     <a:stretch>
                       <a:fillRect/>
                     </a:stretch>
@@ -10873,13 +10828,11 @@
         </w:pict>
       </w:r>
     </w:p>
-    <w:bookmarkEnd w:id="76"/>
-    <w:bookmarkEnd w:id="77"/>
-    <w:bookmarkStart w:id="82" w:name="X64c932a684e890535e031bb03ad1cc252349f38"/>
     <w:p>
       <w:pPr>
         <w:pStyle w:val="Heading2"/>
       </w:pPr>
+      <w:bookmarkStart w:id="79" w:name="_64c932a684e890535e031bb03ad1cc252349f38"/>
       <w:r>
         <w:rPr>
           <w:rStyle w:val="SectionNumber"/>
@@ -10892,12 +10845,13 @@
       <w:r>
         <w:t xml:space="preserve">4.5 Parametric &amp; Non-Parametric Formal Statistical Hypothesis Testing</w:t>
       </w:r>
-    </w:p>
-    <w:bookmarkStart w:id="78" w:name="i.-introduction-4"/>
+      <w:bookmarkEnd w:id="79"/>
+    </w:p>
     <w:p>
       <w:pPr>
         <w:pStyle w:val="Heading3"/>
       </w:pPr>
+      <w:bookmarkStart w:id="80" w:name="_33c775c35e43d7c43967049e702bece67bf6e63"/>
       <w:r>
         <w:rPr>
           <w:rStyle w:val="SectionNumber"/>
@@ -10910,6 +10864,7 @@
       <w:r>
         <w:t xml:space="preserve">i. Introduction</w:t>
       </w:r>
+      <w:bookmarkEnd w:id="80"/>
     </w:p>
     <w:p>
       <w:pPr>
@@ -10919,12 +10874,11 @@
         <w:t xml:space="preserve">Drawing defensible scientific conclusions requires formal statistical verification. In compliance with INT232 Course Outcome 6 (CO6), four rigorous hypothesis tests were formulated and executed.</w:t>
       </w:r>
     </w:p>
-    <w:bookmarkEnd w:id="78"/>
-    <w:bookmarkStart w:id="79" w:name="ii.-general-description-4"/>
     <w:p>
       <w:pPr>
         <w:pStyle w:val="Heading3"/>
       </w:pPr>
+      <w:bookmarkStart w:id="81" w:name="_cdd035068e1bee3a029123285bacc5390fdb5c7"/>
       <w:r>
         <w:rPr>
           <w:rStyle w:val="SectionNumber"/>
@@ -10937,6 +10891,7 @@
       <w:r>
         <w:t xml:space="preserve">ii. General Description</w:t>
       </w:r>
+      <w:bookmarkEnd w:id="81"/>
     </w:p>
     <w:p>
       <w:pPr>
@@ -10946,12 +10901,11 @@
         <w:t xml:space="preserve">The testing framework evaluates seasonal differences via Welch’s two-sample t-test, cross-metropolitan variances via one-way ANOVA, stoichiometric linearity via Pearson correlation testing, and distribution normality via the Kolmogorov-Smirnov test.</w:t>
       </w:r>
     </w:p>
-    <w:bookmarkEnd w:id="79"/>
-    <w:bookmarkStart w:id="80" w:name="X05d92a43c90b757ac77cb916da7b1e0ff32d502"/>
     <w:p>
       <w:pPr>
         <w:pStyle w:val="Heading3"/>
       </w:pPr>
+      <w:bookmarkStart w:id="82" w:name="_05d92a43c90b757ac77cb916da7b1e0ff32d502"/>
       <w:r>
         <w:rPr>
           <w:rStyle w:val="SectionNumber"/>
@@ -10964,6 +10918,7 @@
       <w:r>
         <w:t xml:space="preserve">iii. Specific Requirements, Functions and Formulas</w:t>
       </w:r>
+      <w:bookmarkEnd w:id="82"/>
     </w:p>
     <w:p>
       <w:pPr>
@@ -11498,7 +11453,6 @@
                   <m:r>
                     <m:rPr>
                       <m:nor/>
-                      <m:sty m:val="p"/>
                     </m:rPr>
                     <m:t>MS</m:t>
                   </m:r>
@@ -11507,7 +11461,6 @@
                   <m:r>
                     <m:rPr>
                       <m:nor/>
-                      <m:sty m:val="p"/>
                     </m:rPr>
                     <m:t>between</m:t>
                   </m:r>
@@ -11520,7 +11473,6 @@
                   <m:r>
                     <m:rPr>
                       <m:nor/>
-                      <m:sty m:val="p"/>
                     </m:rPr>
                     <m:t>MS</m:t>
                   </m:r>
@@ -11529,7 +11481,6 @@
                   <m:r>
                     <m:rPr>
                       <m:nor/>
-                      <m:sty m:val="p"/>
                     </m:rPr>
                     <m:t>within</m:t>
                   </m:r>
@@ -11962,12 +11913,11 @@
         <w:t xml:space="preserve">.</w:t>
       </w:r>
     </w:p>
-    <w:bookmarkEnd w:id="80"/>
-    <w:bookmarkStart w:id="81" w:name="iv.-analysis-results-4"/>
     <w:p>
       <w:pPr>
         <w:pStyle w:val="Heading3"/>
       </w:pPr>
+      <w:bookmarkStart w:id="83" w:name="_1e3271f3c08f6f96f0c6be729a7d606cebb583d"/>
       <w:r>
         <w:rPr>
           <w:rStyle w:val="SectionNumber"/>
@@ -11980,6 +11930,7 @@
       <w:r>
         <w:t xml:space="preserve">iv. Analysis Results</w:t>
       </w:r>
+      <w:bookmarkEnd w:id="83"/>
     </w:p>
     <w:p>
       <w:pPr>
@@ -12325,13 +12276,11 @@
         </w:pict>
       </w:r>
     </w:p>
-    <w:bookmarkEnd w:id="81"/>
-    <w:bookmarkEnd w:id="82"/>
-    <w:bookmarkStart w:id="91" w:name="Xadaa68b2d149e9efb23bb4f58e2ef4dba2413e4"/>
     <w:p>
       <w:pPr>
         <w:pStyle w:val="Heading2"/>
       </w:pPr>
+      <w:bookmarkStart w:id="84" w:name="_adaa68b2d149e9efb23bb4f58e2ef4dba2413e4"/>
       <w:r>
         <w:rPr>
           <w:rStyle w:val="SectionNumber"/>
@@ -12344,12 +12293,13 @@
       <w:r>
         <w:t xml:space="preserve">4.6 Native Predictive Time-Series Analytics (ARIMA &amp; Holt-Winters)</w:t>
       </w:r>
-    </w:p>
-    <w:bookmarkStart w:id="83" w:name="i.-introduction-5"/>
+      <w:bookmarkEnd w:id="84"/>
+    </w:p>
     <w:p>
       <w:pPr>
         <w:pStyle w:val="Heading3"/>
       </w:pPr>
+      <w:bookmarkStart w:id="85" w:name="_e3889279104ebef77f240fad79184f819047a1a"/>
       <w:r>
         <w:rPr>
           <w:rStyle w:val="SectionNumber"/>
@@ -12362,6 +12312,7 @@
       <w:r>
         <w:t xml:space="preserve">i. Introduction</w:t>
       </w:r>
+      <w:bookmarkEnd w:id="85"/>
     </w:p>
     <w:p>
       <w:pPr>
@@ -12371,12 +12322,11 @@
         <w:t xml:space="preserve">Proactive environmental management requires forward-looking predictive models to anticipate severe pollution episodes days in advance.</w:t>
       </w:r>
     </w:p>
-    <w:bookmarkEnd w:id="83"/>
-    <w:bookmarkStart w:id="84" w:name="ii.-general-description-5"/>
     <w:p>
       <w:pPr>
         <w:pStyle w:val="Heading3"/>
       </w:pPr>
+      <w:bookmarkStart w:id="86" w:name="_546c909a980e57f798bdd7254dac25334bcd5e2"/>
       <w:r>
         <w:rPr>
           <w:rStyle w:val="SectionNumber"/>
@@ -12389,6 +12339,7 @@
       <w:r>
         <w:t xml:space="preserve">ii. General Description</w:t>
       </w:r>
+      <w:bookmarkEnd w:id="86"/>
     </w:p>
     <w:p>
       <w:pPr>
@@ -12398,12 +12349,11 @@
         <w:t xml:space="preserve">This analysis implements native base R time-series modeling deploying Autoregressive Integrated Moving Average (ARIMA) and Holt-Winters Exponential Smoothing. Models are evaluated using an out-of-sample temporal holdout test set.</w:t>
       </w:r>
     </w:p>
-    <w:bookmarkEnd w:id="84"/>
-    <w:bookmarkStart w:id="85" w:name="X0388811f8add56d6e19b1b4d4f8451f1b2dfa71"/>
     <w:p>
       <w:pPr>
         <w:pStyle w:val="Heading3"/>
       </w:pPr>
+      <w:bookmarkStart w:id="87" w:name="_0388811f8add56d6e19b1b4d4f8451f1b2dfa71"/>
       <w:r>
         <w:rPr>
           <w:rStyle w:val="SectionNumber"/>
@@ -12416,6 +12366,7 @@
       <w:r>
         <w:t xml:space="preserve">iii. Specific Requirements, Functions and Formulas</w:t>
       </w:r>
+      <w:bookmarkEnd w:id="87"/>
     </w:p>
     <w:p>
       <w:pPr>
@@ -12445,7 +12396,6 @@
           <m:r>
             <m:rPr>
               <m:nor/>
-              <m:sty m:val="p"/>
             </m:rPr>
             <m:t>ARIMA</m:t>
           </m:r>
@@ -12722,7 +12672,6 @@
           <m:r>
             <m:rPr>
               <m:nor/>
-              <m:sty m:val="p"/>
             </m:rPr>
             <m:t>Holt-Winters Level: </m:t>
           </m:r>
@@ -12864,7 +12813,6 @@
           <m:r>
             <m:rPr>
               <m:nor/>
-              <m:sty m:val="p"/>
             </m:rPr>
             <m:t>Holt-Winters Trend: </m:t>
           </m:r>
@@ -13006,14 +12954,12 @@
           <m:r>
             <m:rPr>
               <m:nor/>
-              <m:sty m:val="p"/>
             </m:rPr>
             <m:t>Evaluation Metrics: </m:t>
           </m:r>
           <m:r>
             <m:rPr>
               <m:nor/>
-              <m:sty m:val="p"/>
             </m:rPr>
             <m:t>RMSE</m:t>
           </m:r>
@@ -13122,7 +13068,6 @@
           <m:r>
             <m:rPr>
               <m:nor/>
-              <m:sty m:val="p"/>
             </m:rPr>
             <m:t>MAE</m:t>
           </m:r>
@@ -13269,12 +13214,11 @@
         <w:t xml:space="preserve">.</w:t>
       </w:r>
     </w:p>
-    <w:bookmarkEnd w:id="85"/>
-    <w:bookmarkStart w:id="86" w:name="iv.-analysis-results-5"/>
     <w:p>
       <w:pPr>
         <w:pStyle w:val="Heading3"/>
       </w:pPr>
+      <w:bookmarkStart w:id="88" w:name="_de1c70cc6447e05bfccc1828e8435c81d2f91b3"/>
       <w:r>
         <w:rPr>
           <w:rStyle w:val="SectionNumber"/>
@@ -13287,6 +13231,7 @@
       <w:r>
         <w:t xml:space="preserve">iv. Analysis Results</w:t>
       </w:r>
+      <w:bookmarkEnd w:id="88"/>
     </w:p>
     <w:p>
       <w:pPr>
@@ -13347,7 +13292,6 @@
         <m:r>
           <m:rPr>
             <m:nor/>
-            <m:sty m:val="p"/>
           </m:rPr>
           <m:t>ARIMA</m:t>
         </m:r>
@@ -13414,7 +13358,6 @@
         <m:r>
           <m:rPr>
             <m:nor/>
-            <m:sty m:val="p"/>
           </m:rPr>
           <m:t>RMSE</m:t>
         </m:r>
@@ -13438,7 +13381,6 @@
             <m:r>
               <m:rPr>
                 <m:nor/>
-                <m:sty m:val="p"/>
               </m:rPr>
               <m:t>g/m</m:t>
             </m:r>
@@ -13460,7 +13402,6 @@
         <m:r>
           <m:rPr>
             <m:nor/>
-            <m:sty m:val="p"/>
           </m:rPr>
           <m:t>MAE</m:t>
         </m:r>
@@ -13484,7 +13425,6 @@
             <m:r>
               <m:rPr>
                 <m:nor/>
-                <m:sty m:val="p"/>
               </m:rPr>
               <m:t>g/m</m:t>
             </m:r>
@@ -13506,7 +13446,6 @@
         <m:r>
           <m:rPr>
             <m:nor/>
-            <m:sty m:val="p"/>
           </m:rPr>
           <m:t>MAPE</m:t>
         </m:r>
@@ -13552,7 +13491,6 @@
         <m:r>
           <m:rPr>
             <m:nor/>
-            <m:sty m:val="p"/>
           </m:rPr>
           <m:t>RMSE</m:t>
         </m:r>
@@ -13576,7 +13514,6 @@
             <m:r>
               <m:rPr>
                 <m:nor/>
-                <m:sty m:val="p"/>
               </m:rPr>
               <m:t>g/m</m:t>
             </m:r>
@@ -13598,7 +13535,6 @@
         <m:r>
           <m:rPr>
             <m:nor/>
-            <m:sty m:val="p"/>
           </m:rPr>
           <m:t>MAE</m:t>
         </m:r>
@@ -13622,7 +13558,6 @@
             <m:r>
               <m:rPr>
                 <m:nor/>
-                <m:sty m:val="p"/>
               </m:rPr>
               <m:t>g/m</m:t>
             </m:r>
@@ -13644,7 +13579,6 @@
         <m:r>
           <m:rPr>
             <m:nor/>
-            <m:sty m:val="p"/>
           </m:rPr>
           <m:t>MAPE</m:t>
         </m:r>
@@ -13690,12 +13624,11 @@
         <w:t xml:space="preserve">The ARIMA model projected steady-state baseline trajectories with bounded 80% and 95% confidence intervals, providing essential risk bounds for environmental planners.</w:t>
       </w:r>
     </w:p>
-    <w:bookmarkEnd w:id="86"/>
-    <w:bookmarkStart w:id="90" w:name="v.-visualization-4"/>
     <w:p>
       <w:pPr>
         <w:pStyle w:val="Heading3"/>
       </w:pPr>
+      <w:bookmarkStart w:id="89" w:name="_4c5e89e8c5fc9040e8a76de6a973be8363bd2dd"/>
       <w:r>
         <w:rPr>
           <w:rStyle w:val="SectionNumber"/>
@@ -13708,6 +13641,7 @@
       <w:r>
         <w:t xml:space="preserve">v. Visualization</w:t>
       </w:r>
+      <w:bookmarkEnd w:id="89"/>
     </w:p>
     <w:p>
       <w:pPr>
@@ -13716,20 +13650,20 @@
       <w:r>
         <w:drawing>
           <wp:inline>
-            <wp:extent cx="4800600" cy="2667000"/>
+            <wp:extent cx="4800600" cy="2666999"/>
             <wp:effectExtent b="0" l="0" r="0" t="0"/>
-            <wp:docPr descr="Figure 9: 30-Day Predictive PM2.5 Forecast with 80% and 95% Confidence Intervals for Delhi" title="" id="88" name="Picture"/>
+            <wp:docPr descr="Figure 9: 30-Day Predictive PM2.5 Forecast with 80% and 95% Confidence Intervals for Delhi" title="" id="91" name="Picture"/>
             <a:graphic>
               <a:graphicData uri="http://schemas.openxmlformats.org/drawingml/2006/picture">
                 <pic:pic>
                   <pic:nvPicPr>
-                    <pic:cNvPr descr="../outputs/figures/fig9_forecast_delhi.png" id="89" name="Picture"/>
+                    <pic:cNvPr descr="../outputs/figures/fig9_forecast_delhi.png" id="92" name="Picture"/>
                     <pic:cNvPicPr>
                       <a:picLocks noChangeArrowheads="1" noChangeAspect="1"/>
                     </pic:cNvPicPr>
                   </pic:nvPicPr>
                   <pic:blipFill>
-                    <a:blip r:embed="rId87"/>
+                    <a:blip r:embed="rId90"/>
                     <a:stretch>
                       <a:fillRect/>
                     </a:stretch>
@@ -13737,7 +13671,7 @@
                   <pic:spPr bwMode="auto">
                     <a:xfrm>
                       <a:off x="0" y="0"/>
-                      <a:ext cx="4800600" cy="2667000"/>
+                      <a:ext cx="4800600" cy="2666999"/>
                     </a:xfrm>
                     <a:prstGeom prst="rect">
                       <a:avLst/>
@@ -13771,13 +13705,11 @@
         </w:pict>
       </w:r>
     </w:p>
-    <w:bookmarkEnd w:id="90"/>
-    <w:bookmarkEnd w:id="91"/>
-    <w:bookmarkStart w:id="100" w:name="X89bcfb78cc550471636f380ede3e04bd6e5a150"/>
     <w:p>
       <w:pPr>
         <w:pStyle w:val="Heading2"/>
       </w:pPr>
+      <w:bookmarkStart w:id="93" w:name="_89bcfb78cc550471636f380ede3e04bd6e5a150"/>
       <w:r>
         <w:rPr>
           <w:rStyle w:val="SectionNumber"/>
@@ -13790,12 +13722,13 @@
       <w:r>
         <w:t xml:space="preserve">4.7 Text Mining of CPCB Statutory Health Advisories &amp; Semantic Word Cloud</w:t>
       </w:r>
-    </w:p>
-    <w:bookmarkStart w:id="92" w:name="i.-introduction-6"/>
+      <w:bookmarkEnd w:id="93"/>
+    </w:p>
     <w:p>
       <w:pPr>
         <w:pStyle w:val="Heading3"/>
       </w:pPr>
+      <w:bookmarkStart w:id="94" w:name="_3bd2838b4bc42bcaa0a3eaddc11570c13c6a5cb"/>
       <w:r>
         <w:rPr>
           <w:rStyle w:val="SectionNumber"/>
@@ -13808,6 +13741,7 @@
       <w:r>
         <w:t xml:space="preserve">i. Introduction</w:t>
       </w:r>
+      <w:bookmarkEnd w:id="94"/>
     </w:p>
     <w:p>
       <w:pPr>
@@ -13817,12 +13751,11 @@
         <w:t xml:space="preserve">Translating air quality data into societal benefit requires actionable public health communication. Text mining of official health advisories extracts core regulatory directives and mitigation vocabulary.</w:t>
       </w:r>
     </w:p>
-    <w:bookmarkEnd w:id="92"/>
-    <w:bookmarkStart w:id="93" w:name="ii.-general-description-6"/>
     <w:p>
       <w:pPr>
         <w:pStyle w:val="Heading3"/>
       </w:pPr>
+      <w:bookmarkStart w:id="95" w:name="_7f6007fbd66cc256adabd802599bf238a54ca91"/>
       <w:r>
         <w:rPr>
           <w:rStyle w:val="SectionNumber"/>
@@ -13835,6 +13768,7 @@
       <w:r>
         <w:t xml:space="preserve">ii. General Description</w:t>
       </w:r>
+      <w:bookmarkEnd w:id="95"/>
     </w:p>
     <w:p>
       <w:pPr>
@@ -13844,12 +13778,11 @@
         <w:t xml:space="preserve">A structured corpus of statutory CPCB health advisories across all six AQI categories and municipal mitigation frameworks was tokenized, cleaned, and analyzed for term frequency.</w:t>
       </w:r>
     </w:p>
-    <w:bookmarkEnd w:id="93"/>
-    <w:bookmarkStart w:id="94" w:name="X6450257f4da77fac8ea5bc2e2923d0d1f511dc1"/>
     <w:p>
       <w:pPr>
         <w:pStyle w:val="Heading3"/>
       </w:pPr>
+      <w:bookmarkStart w:id="96" w:name="_6450257f4da77fac8ea5bc2e2923d0d1f511dc1"/>
       <w:r>
         <w:rPr>
           <w:rStyle w:val="SectionNumber"/>
@@ -13862,6 +13795,7 @@
       <w:r>
         <w:t xml:space="preserve">iii. Specific Requirements, Functions and Formulas</w:t>
       </w:r>
+      <w:bookmarkEnd w:id="96"/>
     </w:p>
     <w:p>
       <w:pPr>
@@ -13891,14 +13825,12 @@
           <m:r>
             <m:rPr>
               <m:nor/>
-              <m:sty m:val="p"/>
             </m:rPr>
             <m:t>Term Frequency </m:t>
           </m:r>
           <m:r>
             <m:rPr>
               <m:nor/>
-              <m:sty m:val="p"/>
             </m:rPr>
             <m:t>TF</m:t>
           </m:r>
@@ -14103,12 +14035,11 @@
         <w:t xml:space="preserve">.</w:t>
       </w:r>
     </w:p>
-    <w:bookmarkEnd w:id="94"/>
-    <w:bookmarkStart w:id="95" w:name="iv.-analysis-results-6"/>
     <w:p>
       <w:pPr>
         <w:pStyle w:val="Heading3"/>
       </w:pPr>
+      <w:bookmarkStart w:id="97" w:name="_35e66b76591a666cb3d33b247200e5773b64640"/>
       <w:r>
         <w:rPr>
           <w:rStyle w:val="SectionNumber"/>
@@ -14121,6 +14052,7 @@
       <w:r>
         <w:t xml:space="preserve">iv. Analysis Results</w:t>
       </w:r>
+      <w:bookmarkEnd w:id="97"/>
     </w:p>
     <w:p>
       <w:pPr>
@@ -14302,12 +14234,11 @@
         <w:t xml:space="preserve">(2).</w:t>
       </w:r>
     </w:p>
-    <w:bookmarkEnd w:id="95"/>
-    <w:bookmarkStart w:id="99" w:name="v.-visualization-5"/>
     <w:p>
       <w:pPr>
         <w:pStyle w:val="Heading3"/>
       </w:pPr>
+      <w:bookmarkStart w:id="98" w:name="_ecf6c149b49f4e23523e037d1ed5ff42cc72cc2"/>
       <w:r>
         <w:rPr>
           <w:rStyle w:val="SectionNumber"/>
@@ -14320,6 +14251,7 @@
       <w:r>
         <w:t xml:space="preserve">v. Visualization</w:t>
       </w:r>
+      <w:bookmarkEnd w:id="98"/>
     </w:p>
     <w:p>
       <w:pPr>
@@ -14330,18 +14262,18 @@
           <wp:inline>
             <wp:extent cx="4800600" cy="4000500"/>
             <wp:effectExtent b="0" l="0" r="0" t="0"/>
-            <wp:docPr descr="Figure 6: High-Resolution Word Cloud Mined from Statutory CPCB Environmental Health Advisories" title="" id="97" name="Picture"/>
+            <wp:docPr descr="Figure 6: High-Resolution Word Cloud Mined from Statutory CPCB Environmental Health Advisories" title="" id="100" name="Picture"/>
             <a:graphic>
               <a:graphicData uri="http://schemas.openxmlformats.org/drawingml/2006/picture">
                 <pic:pic>
                   <pic:nvPicPr>
-                    <pic:cNvPr descr="../outputs/figures/fig6_advisory_wordcloud.png" id="98" name="Picture"/>
+                    <pic:cNvPr descr="../outputs/figures/fig6_advisory_wordcloud.png" id="101" name="Picture"/>
                     <pic:cNvPicPr>
                       <a:picLocks noChangeArrowheads="1" noChangeAspect="1"/>
                     </pic:cNvPicPr>
                   </pic:nvPicPr>
                   <pic:blipFill>
-                    <a:blip r:embed="rId96"/>
+                    <a:blip r:embed="rId99"/>
                     <a:stretch>
                       <a:fillRect/>
                     </a:stretch>
@@ -14383,13 +14315,11 @@
         </w:pict>
       </w:r>
     </w:p>
-    <w:bookmarkEnd w:id="99"/>
-    <w:bookmarkEnd w:id="100"/>
-    <w:bookmarkStart w:id="105" w:name="X10fada97ffa373644c1b3a990915c6e4b9a0502"/>
     <w:p>
       <w:pPr>
         <w:pStyle w:val="Heading2"/>
       </w:pPr>
+      <w:bookmarkStart w:id="102" w:name="_10fada97ffa373644c1b3a990915c6e4b9a0502"/>
       <w:r>
         <w:rPr>
           <w:rStyle w:val="SectionNumber"/>
@@ -14402,12 +14332,13 @@
       <w:r>
         <w:t xml:space="preserve">4.8 Environmental Vulnerability Index (EVI) &amp; Automated Municipal Decision Support</w:t>
       </w:r>
-    </w:p>
-    <w:bookmarkStart w:id="101" w:name="i.-introduction-7"/>
+      <w:bookmarkEnd w:id="102"/>
+    </w:p>
     <w:p>
       <w:pPr>
         <w:pStyle w:val="Heading3"/>
       </w:pPr>
+      <w:bookmarkStart w:id="103" w:name="_ef48838bce7266380781cdd6dfd70dc5583a268"/>
       <w:r>
         <w:rPr>
           <w:rStyle w:val="SectionNumber"/>
@@ -14420,6 +14351,7 @@
       <w:r>
         <w:t xml:space="preserve">i. Introduction</w:t>
       </w:r>
+      <w:bookmarkEnd w:id="103"/>
     </w:p>
     <w:p>
       <w:pPr>
@@ -14429,12 +14361,11 @@
         <w:t xml:space="preserve">Single-variable rankings (such as mean AQI alone) fail to capture chronic exposure versus acute peak hazards. An integrated multi-criteria index is required for objective municipal resource allocation.</w:t>
       </w:r>
     </w:p>
-    <w:bookmarkEnd w:id="101"/>
-    <w:bookmarkStart w:id="102" w:name="ii.-general-description-7"/>
     <w:p>
       <w:pPr>
         <w:pStyle w:val="Heading3"/>
       </w:pPr>
+      <w:bookmarkStart w:id="104" w:name="_bf28ffd852fc38ccc76cc8f1ce608ad0a6a06ab"/>
       <w:r>
         <w:rPr>
           <w:rStyle w:val="SectionNumber"/>
@@ -14447,6 +14378,7 @@
       <w:r>
         <w:t xml:space="preserve">ii. General Description</w:t>
       </w:r>
+      <w:bookmarkEnd w:id="104"/>
     </w:p>
     <w:p>
       <w:pPr>
@@ -14489,12 +14421,11 @@
         <w:t xml:space="preserve">).</w:t>
       </w:r>
     </w:p>
-    <w:bookmarkEnd w:id="102"/>
-    <w:bookmarkStart w:id="103" w:name="X3c9bc629303d18e9ce77f2bf8a938ea6ca6f990"/>
     <w:p>
       <w:pPr>
         <w:pStyle w:val="Heading3"/>
       </w:pPr>
+      <w:bookmarkStart w:id="105" w:name="_3c9bc629303d18e9ce77f2bf8a938ea6ca6f990"/>
       <w:r>
         <w:rPr>
           <w:rStyle w:val="SectionNumber"/>
@@ -14507,6 +14438,7 @@
       <w:r>
         <w:t xml:space="preserve">iii. Specific Requirements, Functions and Formulas</w:t>
       </w:r>
+      <w:bookmarkEnd w:id="105"/>
     </w:p>
     <w:p>
       <w:pPr>
@@ -14538,7 +14470,6 @@
               <m:r>
                 <m:rPr>
                   <m:nor/>
-                  <m:sty m:val="p"/>
                 </m:rPr>
                 <m:t>EVI</m:t>
               </m:r>
@@ -14587,7 +14518,6 @@
                           <m:r>
                             <m:rPr>
                               <m:nor/>
-                              <m:sty m:val="p"/>
                             </m:rPr>
                             <m:t>AQI</m:t>
                           </m:r>
@@ -14620,7 +14550,6 @@
                       <m:r>
                         <m:rPr>
                           <m:nor/>
-                          <m:sty m:val="p"/>
                         </m:rPr>
                         <m:t>AQI</m:t>
                       </m:r>
@@ -14642,7 +14571,6 @@
                       <m:r>
                         <m:rPr>
                           <m:nor/>
-                          <m:sty m:val="p"/>
                         </m:rPr>
                         <m:t>AQI</m:t>
                       </m:r>
@@ -14668,7 +14596,6 @@
                       <m:r>
                         <m:rPr>
                           <m:nor/>
-                          <m:sty m:val="p"/>
                         </m:rPr>
                         <m:t>AQI</m:t>
                       </m:r>
@@ -14712,7 +14639,6 @@
               <m:r>
                 <m:rPr>
                   <m:nor/>
-                  <m:sty m:val="p"/>
                 </m:rPr>
                 <m:t>severe</m:t>
               </m:r>
@@ -14752,7 +14678,6 @@
               <m:r>
                 <m:rPr>
                   <m:nor/>
-                  <m:sty m:val="p"/>
                 </m:rPr>
                 <m:t>exceed</m:t>
               </m:r>
@@ -14805,7 +14730,6 @@
         <m:r>
           <m:rPr>
             <m:nor/>
-            <m:sty m:val="p"/>
           </m:rPr>
           <m:t>EVI</m:t>
         </m:r>
@@ -14861,7 +14785,6 @@
         <m:r>
           <m:rPr>
             <m:nor/>
-            <m:sty m:val="p"/>
           </m:rPr>
           <m:t>EVI</m:t>
         </m:r>
@@ -14908,7 +14831,6 @@
         <m:r>
           <m:rPr>
             <m:nor/>
-            <m:sty m:val="p"/>
           </m:rPr>
           <m:t>EVI</m:t>
         </m:r>
@@ -14936,12 +14858,11 @@
         <w:t xml:space="preserve">Routine maintenance and baseline monitoring.</w:t>
       </w:r>
     </w:p>
-    <w:bookmarkEnd w:id="103"/>
-    <w:bookmarkStart w:id="104" w:name="iv.-analysis-results-7"/>
     <w:p>
       <w:pPr>
         <w:pStyle w:val="Heading3"/>
       </w:pPr>
+      <w:bookmarkStart w:id="106" w:name="_77e05ae3cc80103225d9f001eb38a41cb61ab6a"/>
       <w:r>
         <w:rPr>
           <w:rStyle w:val="SectionNumber"/>
@@ -14954,6 +14875,7 @@
       <w:r>
         <w:t xml:space="preserve">iv. Analysis Results</w:t>
       </w:r>
+      <w:bookmarkEnd w:id="106"/>
     </w:p>
     <w:p>
       <w:pPr>
@@ -15874,13 +15796,11 @@
         </w:pict>
       </w:r>
     </w:p>
-    <w:bookmarkEnd w:id="104"/>
-    <w:bookmarkEnd w:id="105"/>
-    <w:bookmarkStart w:id="110" w:name="Xd5b80c1c2f577a023229d9990c32a15baa43b47"/>
     <w:p>
       <w:pPr>
         <w:pStyle w:val="Heading2"/>
       </w:pPr>
+      <w:bookmarkStart w:id="107" w:name="_d5b80c1c2f577a023229d9990c32a15baa43b47"/>
       <w:r>
         <w:rPr>
           <w:rStyle w:val="SectionNumber"/>
@@ -15893,12 +15813,13 @@
       <w:r>
         <w:t xml:space="preserve">4.9 Relational SQL Analytics via Embedded SQLite Engine</w:t>
       </w:r>
-    </w:p>
-    <w:bookmarkStart w:id="106" w:name="i.-introduction-8"/>
+      <w:bookmarkEnd w:id="107"/>
+    </w:p>
     <w:p>
       <w:pPr>
         <w:pStyle w:val="Heading3"/>
       </w:pPr>
+      <w:bookmarkStart w:id="108" w:name="_c64eca1f9eb72990d8ff27b71747c20ec801d58"/>
       <w:r>
         <w:rPr>
           <w:rStyle w:val="SectionNumber"/>
@@ -15911,6 +15832,7 @@
       <w:r>
         <w:t xml:space="preserve">i. Introduction</w:t>
       </w:r>
+      <w:bookmarkEnd w:id="108"/>
     </w:p>
     <w:p>
       <w:pPr>
@@ -15920,12 +15842,11 @@
         <w:t xml:space="preserve">Enterprise environmental monitoring systems require structured relational backends to handle high-frequency queries without loading monolithic CSV files into application memory.</w:t>
       </w:r>
     </w:p>
-    <w:bookmarkEnd w:id="106"/>
-    <w:bookmarkStart w:id="107" w:name="ii.-general-description-8"/>
     <w:p>
       <w:pPr>
         <w:pStyle w:val="Heading3"/>
       </w:pPr>
+      <w:bookmarkStart w:id="109" w:name="_955d2ab18b46756daf57571a8a2b2be62f63286"/>
       <w:r>
         <w:rPr>
           <w:rStyle w:val="SectionNumber"/>
@@ -15938,6 +15859,7 @@
       <w:r>
         <w:t xml:space="preserve">ii. General Description</w:t>
       </w:r>
+      <w:bookmarkEnd w:id="109"/>
     </w:p>
     <w:p>
       <w:pPr>
@@ -15989,12 +15911,11 @@
         <w:t xml:space="preserve">, executing multi-table joins, grouped aggregations, and filtered sub-queries.</w:t>
       </w:r>
     </w:p>
-    <w:bookmarkEnd w:id="107"/>
-    <w:bookmarkStart w:id="108" w:name="X3e07e0e7d0881b86b49e80008c5f4af6853ec62"/>
     <w:p>
       <w:pPr>
         <w:pStyle w:val="Heading3"/>
       </w:pPr>
+      <w:bookmarkStart w:id="110" w:name="_3e07e0e7d0881b86b49e80008c5f4af6853ec62"/>
       <w:r>
         <w:rPr>
           <w:rStyle w:val="SectionNumber"/>
@@ -16007,6 +15928,7 @@
       <w:r>
         <w:t xml:space="preserve">iii. Specific Requirements, Functions and Formulas</w:t>
       </w:r>
+      <w:bookmarkEnd w:id="110"/>
     </w:p>
     <w:p>
       <w:pPr>
@@ -16463,12 +16385,11 @@
         <w:t xml:space="preserve">;</w:t>
       </w:r>
     </w:p>
-    <w:bookmarkEnd w:id="108"/>
-    <w:bookmarkStart w:id="109" w:name="iv.-analysis-results-8"/>
     <w:p>
       <w:pPr>
         <w:pStyle w:val="Heading3"/>
       </w:pPr>
+      <w:bookmarkStart w:id="111" w:name="_abef589479602b00dfce3f0e4abd99901549f1a"/>
       <w:r>
         <w:rPr>
           <w:rStyle w:val="SectionNumber"/>
@@ -16481,6 +16402,7 @@
       <w:r>
         <w:t xml:space="preserve">iv. Analysis Results</w:t>
       </w:r>
+      <w:bookmarkEnd w:id="111"/>
     </w:p>
     <w:p>
       <w:pPr>
@@ -16961,13 +16883,11 @@
         </w:pict>
       </w:r>
     </w:p>
-    <w:bookmarkEnd w:id="109"/>
-    <w:bookmarkEnd w:id="110"/>
-    <w:bookmarkStart w:id="119" w:name="Xc34257d9718de95c150256b32d83697f29190f4"/>
     <w:p>
       <w:pPr>
         <w:pStyle w:val="Heading2"/>
       </w:pPr>
+      <w:bookmarkStart w:id="112" w:name="_c34257d9718de95c150256b32d83697f29190f4"/>
       <w:r>
         <w:rPr>
           <w:rStyle w:val="SectionNumber"/>
@@ -16980,12 +16900,13 @@
       <w:r>
         <w:t xml:space="preserve">4.10 National CAAQMS Geographic Station Network &amp; Spatial Exploration</w:t>
       </w:r>
-    </w:p>
-    <w:bookmarkStart w:id="111" w:name="i.-introduction-9"/>
+      <w:bookmarkEnd w:id="112"/>
+    </w:p>
     <w:p>
       <w:pPr>
         <w:pStyle w:val="Heading3"/>
       </w:pPr>
+      <w:bookmarkStart w:id="113" w:name="_6ae090e34e2ade9e5100e990b0a8d55af72d136"/>
       <w:r>
         <w:rPr>
           <w:rStyle w:val="SectionNumber"/>
@@ -16998,6 +16919,7 @@
       <w:r>
         <w:t xml:space="preserve">i. Introduction</w:t>
       </w:r>
+      <w:bookmarkEnd w:id="113"/>
     </w:p>
     <w:p>
       <w:pPr>
@@ -17007,12 +16929,11 @@
         <w:t xml:space="preserve">Ambient monitoring stations are distributed heterogeneously across India. Visualizing station density and spatial distribution provides context on monitoring equity.</w:t>
       </w:r>
     </w:p>
-    <w:bookmarkEnd w:id="111"/>
-    <w:bookmarkStart w:id="112" w:name="ii.-general-description-9"/>
     <w:p>
       <w:pPr>
         <w:pStyle w:val="Heading3"/>
       </w:pPr>
+      <w:bookmarkStart w:id="114" w:name="_02a2afa42bf9d1cf3e1d396d0e80cfa6ec0f9c9"/>
       <w:r>
         <w:rPr>
           <w:rStyle w:val="SectionNumber"/>
@@ -17025,6 +16946,7 @@
       <w:r>
         <w:t xml:space="preserve">ii. General Description</w:t>
       </w:r>
+      <w:bookmarkEnd w:id="114"/>
     </w:p>
     <w:p>
       <w:pPr>
@@ -17049,12 +16971,11 @@
         <w:t xml:space="preserve">were validated and mapped across all 230 CAAQMS monitoring points across India.</w:t>
       </w:r>
     </w:p>
-    <w:bookmarkEnd w:id="112"/>
-    <w:bookmarkStart w:id="113" w:name="Xed0028784982be6da018bb784e73520fc51801c"/>
     <w:p>
       <w:pPr>
         <w:pStyle w:val="Heading3"/>
       </w:pPr>
+      <w:bookmarkStart w:id="115" w:name="_ed0028784982be6da018bb784e73520fc51801c"/>
       <w:r>
         <w:rPr>
           <w:rStyle w:val="SectionNumber"/>
@@ -17067,6 +16988,7 @@
       <w:r>
         <w:t xml:space="preserve">iii. Specific Requirements, Functions and Formulas</w:t>
       </w:r>
+      <w:bookmarkEnd w:id="115"/>
     </w:p>
     <w:p>
       <w:pPr>
@@ -17113,7 +17035,6 @@
         <m:r>
           <m:rPr>
             <m:nor/>
-            <m:sty m:val="p"/>
           </m:rPr>
           <m:t>N</m:t>
         </m:r>
@@ -17141,7 +17062,6 @@
         <m:r>
           <m:rPr>
             <m:nor/>
-            <m:sty m:val="p"/>
           </m:rPr>
           <m:t>N</m:t>
         </m:r>
@@ -17189,7 +17109,6 @@
         <m:r>
           <m:rPr>
             <m:nor/>
-            <m:sty m:val="p"/>
           </m:rPr>
           <m:t>E</m:t>
         </m:r>
@@ -17217,7 +17136,6 @@
         <m:r>
           <m:rPr>
             <m:nor/>
-            <m:sty m:val="p"/>
           </m:rPr>
           <m:t>E</m:t>
         </m:r>
@@ -17280,12 +17198,11 @@
         <w:t xml:space="preserve">.</w:t>
       </w:r>
     </w:p>
-    <w:bookmarkEnd w:id="113"/>
-    <w:bookmarkStart w:id="114" w:name="iv.-analysis-results-9"/>
     <w:p>
       <w:pPr>
         <w:pStyle w:val="Heading3"/>
       </w:pPr>
+      <w:bookmarkStart w:id="116" w:name="_08a3e733733fa7e3714e96fddbe348bdc1d306b"/>
       <w:r>
         <w:rPr>
           <w:rStyle w:val="SectionNumber"/>
@@ -17298,6 +17215,7 @@
       <w:r>
         <w:t xml:space="preserve">iv. Analysis Results</w:t>
       </w:r>
+      <w:bookmarkEnd w:id="116"/>
     </w:p>
     <w:p>
       <w:pPr>
@@ -17325,12 +17243,11 @@
         <w:t xml:space="preserve">- Vast regions in central, eastern, and north-eastern India remain severely under-monitored, highlighting the urgent need for expanded sensor infrastructure.</w:t>
       </w:r>
     </w:p>
-    <w:bookmarkEnd w:id="114"/>
-    <w:bookmarkStart w:id="118" w:name="v.-visualization-6"/>
     <w:p>
       <w:pPr>
         <w:pStyle w:val="Heading3"/>
       </w:pPr>
+      <w:bookmarkStart w:id="117" w:name="_559ba4397e8906214ea8ea23157bcfb25ad6bfb"/>
       <w:r>
         <w:rPr>
           <w:rStyle w:val="SectionNumber"/>
@@ -17343,6 +17260,7 @@
       <w:r>
         <w:t xml:space="preserve">v. Visualization</w:t>
       </w:r>
+      <w:bookmarkEnd w:id="117"/>
     </w:p>
     <w:p>
       <w:pPr>
@@ -17353,18 +17271,18 @@
           <wp:inline>
             <wp:extent cx="4800600" cy="4800600"/>
             <wp:effectExtent b="0" l="0" r="0" t="0"/>
-            <wp:docPr descr="Figure 7: National Continuous Ambient Air Quality Monitoring Network (CAAQMS) Station Locations across India" title="" id="116" name="Picture"/>
+            <wp:docPr descr="Figure 7: National Continuous Ambient Air Quality Monitoring Network (CAAQMS) Station Locations across India" title="" id="119" name="Picture"/>
             <a:graphic>
               <a:graphicData uri="http://schemas.openxmlformats.org/drawingml/2006/picture">
                 <pic:pic>
                   <pic:nvPicPr>
-                    <pic:cNvPr descr="../outputs/figures/fig7_station_network_map.png" id="117" name="Picture"/>
+                    <pic:cNvPr descr="../outputs/figures/fig7_station_network_map.png" id="120" name="Picture"/>
                     <pic:cNvPicPr>
                       <a:picLocks noChangeArrowheads="1" noChangeAspect="1"/>
                     </pic:cNvPicPr>
                   </pic:nvPicPr>
                   <pic:blipFill>
-                    <a:blip r:embed="rId115"/>
+                    <a:blip r:embed="rId118"/>
                     <a:stretch>
                       <a:fillRect/>
                     </a:stretch>
@@ -17399,14 +17317,11 @@
         <w:t xml:space="preserve">Figure 7: National Continuous Ambient Air Quality Monitoring Network (CAAQMS) Station Locations across India</w:t>
       </w:r>
     </w:p>
-    <w:bookmarkEnd w:id="118"/>
-    <w:bookmarkEnd w:id="119"/>
-    <w:bookmarkEnd w:id="120"/>
-    <w:bookmarkStart w:id="124" w:name="Xe6de61dbdb8fc57913da9e5dda7c7e708e7cf7a"/>
     <w:p>
       <w:pPr>
         <w:pStyle w:val="Heading1"/>
       </w:pPr>
+      <w:bookmarkStart w:id="121" w:name="_e6de61dbdb8fc57913da9e5dda7c7e708e7cf7a"/>
       <w:r>
         <w:rPr>
           <w:rStyle w:val="SectionNumber"/>
@@ -17419,12 +17334,13 @@
       <w:r>
         <w:t xml:space="preserve">5. DASHBOARD DESIGN &amp; INTERACTIVE USER EXPERIENCE</w:t>
       </w:r>
-    </w:p>
-    <w:bookmarkStart w:id="121" w:name="Xe5188c559f9413956f65c7689ae6a83401728ed"/>
+      <w:bookmarkEnd w:id="121"/>
+    </w:p>
     <w:p>
       <w:pPr>
         <w:pStyle w:val="Heading2"/>
       </w:pPr>
+      <w:bookmarkStart w:id="122" w:name="_e5188c559f9413956f65c7689ae6a83401728ed"/>
       <w:r>
         <w:rPr>
           <w:rStyle w:val="SectionNumber"/>
@@ -17446,6 +17362,7 @@
       <w:r>
         <w:t xml:space="preserve">)</w:t>
       </w:r>
+      <w:bookmarkEnd w:id="122"/>
     </w:p>
     <w:p>
       <w:pPr>
@@ -17773,12 +17690,11 @@
         </w:tc>
       </w:tr>
     </w:tbl>
-    <w:bookmarkEnd w:id="121"/>
-    <w:bookmarkStart w:id="122" w:name="X7db899cf0a051c72b125b81efd698de34cfb61b"/>
     <w:p>
       <w:pPr>
         <w:pStyle w:val="Heading2"/>
       </w:pPr>
+      <w:bookmarkStart w:id="123" w:name="_7db899cf0a051c72b125b81efd698de34cfb61b"/>
       <w:r>
         <w:rPr>
           <w:rStyle w:val="SectionNumber"/>
@@ -17791,6 +17707,7 @@
       <w:r>
         <w:t xml:space="preserve">5.2 Responsive State Management &amp; Fail-Safe Controls</w:t>
       </w:r>
+      <w:bookmarkEnd w:id="123"/>
     </w:p>
     <w:p>
       <w:pPr>
@@ -17918,12 +17835,11 @@
         <w:t xml:space="preserve">without crashing.</w:t>
       </w:r>
     </w:p>
-    <w:bookmarkEnd w:id="122"/>
-    <w:bookmarkStart w:id="123" w:name="X9f3e3d48f30a73d9a428690cf83400c745bfeb6"/>
     <w:p>
       <w:pPr>
         <w:pStyle w:val="Heading2"/>
       </w:pPr>
+      <w:bookmarkStart w:id="124" w:name="_9f3e3d48f30a73d9a428690cf83400c745bfeb6"/>
       <w:r>
         <w:rPr>
           <w:rStyle w:val="SectionNumber"/>
@@ -17960,6 +17876,7 @@
       <w:r>
         <w:t xml:space="preserve">)</w:t>
       </w:r>
+      <w:bookmarkEnd w:id="124"/>
     </w:p>
     <w:p>
       <w:pPr>
@@ -18221,13 +18138,11 @@
         <w:t xml:space="preserve">Traceable mapping across all assessment criteria.</w:t>
       </w:r>
     </w:p>
-    <w:bookmarkEnd w:id="123"/>
-    <w:bookmarkEnd w:id="124"/>
-    <w:bookmarkStart w:id="128" w:name="key-insights-and-societal-benefit"/>
     <w:p>
       <w:pPr>
         <w:pStyle w:val="Heading1"/>
       </w:pPr>
+      <w:bookmarkStart w:id="125" w:name="_99cbc8b6863d95d1da5667a605c04418db35f4d"/>
       <w:r>
         <w:rPr>
           <w:rStyle w:val="SectionNumber"/>
@@ -18240,12 +18155,13 @@
       <w:r>
         <w:t xml:space="preserve">6. KEY INSIGHTS AND SOCIETAL BENEFIT</w:t>
       </w:r>
-    </w:p>
-    <w:bookmarkStart w:id="125" w:name="core-scientific-findings"/>
+      <w:bookmarkEnd w:id="125"/>
+    </w:p>
     <w:p>
       <w:pPr>
         <w:pStyle w:val="Heading2"/>
       </w:pPr>
+      <w:bookmarkStart w:id="126" w:name="_4e215c77f50c099f353457e772910f4a6128997"/>
       <w:r>
         <w:rPr>
           <w:rStyle w:val="SectionNumber"/>
@@ -18258,6 +18174,7 @@
       <w:r>
         <w:t xml:space="preserve">6.1 Core Scientific Findings</w:t>
       </w:r>
+      <w:bookmarkEnd w:id="126"/>
     </w:p>
     <w:p>
       <w:pPr>
@@ -18324,7 +18241,6 @@
             <m:r>
               <m:rPr>
                 <m:nor/>
-                <m:sty m:val="p"/>
               </m:rPr>
               <m:t>g/m</m:t>
             </m:r>
@@ -18386,7 +18302,6 @@
             <m:r>
               <m:rPr>
                 <m:nor/>
-                <m:sty m:val="p"/>
               </m:rPr>
               <m:t>g/m</m:t>
             </m:r>
@@ -18540,12 +18455,11 @@
         <w:t xml:space="preserve">Bollinger Bands successfully isolate post-monsoon stubble burning and festival fireworks events from chronic urban traffic baselines.</w:t>
       </w:r>
     </w:p>
-    <w:bookmarkEnd w:id="125"/>
-    <w:bookmarkStart w:id="126" w:name="stakeholder-impact-matrix"/>
     <w:p>
       <w:pPr>
         <w:pStyle w:val="Heading2"/>
       </w:pPr>
+      <w:bookmarkStart w:id="127" w:name="_46cff0e4b1316907a9ad6abfdd0cf5b17b7c4a3"/>
       <w:r>
         <w:rPr>
           <w:rStyle w:val="SectionNumber"/>
@@ -18558,6 +18472,7 @@
       <w:r>
         <w:t xml:space="preserve">6.2 Stakeholder Impact Matrix</w:t>
       </w:r>
+      <w:bookmarkEnd w:id="127"/>
     </w:p>
     <w:p>
       <w:pPr>
@@ -18812,12 +18727,11 @@
         </w:tc>
       </w:tr>
     </w:tbl>
-    <w:bookmarkEnd w:id="126"/>
-    <w:bookmarkStart w:id="127" w:name="X9938ce2530db0e2346da31ccecfc0e67f7054bb"/>
     <w:p>
       <w:pPr>
         <w:pStyle w:val="Heading2"/>
       </w:pPr>
+      <w:bookmarkStart w:id="128" w:name="_9938ce2530db0e2346da31ccecfc0e67f7054bb"/>
       <w:r>
         <w:rPr>
           <w:rStyle w:val="SectionNumber"/>
@@ -18830,6 +18744,7 @@
       <w:r>
         <w:t xml:space="preserve">6.3 Ethical Principles in Environmental Risk Communication</w:t>
       </w:r>
+      <w:bookmarkEnd w:id="128"/>
     </w:p>
     <w:p>
       <w:pPr>
@@ -18867,13 +18782,11 @@
         <w:t xml:space="preserve">Transparently document historical boundaries (data ends July 2020) and encourage validation against live official portals for immediate daily precautions.</w:t>
       </w:r>
     </w:p>
-    <w:bookmarkEnd w:id="127"/>
-    <w:bookmarkEnd w:id="128"/>
-    <w:bookmarkStart w:id="129" w:name="Xb43a05d91f5f7298ab45547c18f6717c0f54585"/>
     <w:p>
       <w:pPr>
         <w:pStyle w:val="Heading1"/>
       </w:pPr>
+      <w:bookmarkStart w:id="129" w:name="_b43a05d91f5f7298ab45547c18f6717c0f54585"/>
       <w:r>
         <w:rPr>
           <w:rStyle w:val="SectionNumber"/>
@@ -18886,6 +18799,7 @@
       <w:r>
         <w:t xml:space="preserve">7. LIMITATIONS, GOVERNANCE &amp; RESPONSIBLE ANALYTICS</w:t>
       </w:r>
+      <w:bookmarkEnd w:id="129"/>
     </w:p>
     <w:p>
       <w:pPr>
@@ -19140,12 +19054,11 @@
         </w:tc>
       </w:tr>
     </w:tbl>
-    <w:bookmarkEnd w:id="129"/>
-    <w:bookmarkStart w:id="132" w:name="conclusion-system-evaluation"/>
     <w:p>
       <w:pPr>
         <w:pStyle w:val="Heading1"/>
       </w:pPr>
+      <w:bookmarkStart w:id="130" w:name="_33a8c7333b39fb79c02dbb79a949eb5ac94186f"/>
       <w:r>
         <w:rPr>
           <w:rStyle w:val="SectionNumber"/>
@@ -19158,12 +19071,13 @@
       <w:r>
         <w:t xml:space="preserve">8. CONCLUSION &amp; SYSTEM EVALUATION</w:t>
       </w:r>
-    </w:p>
-    <w:bookmarkStart w:id="130" w:name="summary-of-project-outcomes"/>
+      <w:bookmarkEnd w:id="130"/>
+    </w:p>
     <w:p>
       <w:pPr>
         <w:pStyle w:val="Heading2"/>
       </w:pPr>
+      <w:bookmarkStart w:id="131" w:name="_5ee055677fb101ccbf8ecd47339ece390214b86"/>
       <w:r>
         <w:rPr>
           <w:rStyle w:val="SectionNumber"/>
@@ -19176,6 +19090,7 @@
       <w:r>
         <w:t xml:space="preserve">8.1 Summary of Project Outcomes</w:t>
       </w:r>
+      <w:bookmarkEnd w:id="131"/>
     </w:p>
     <w:p>
       <w:pPr>
@@ -19392,12 +19307,11 @@
         <w:t xml:space="preserve">Delivered an objective Environmental Vulnerability Index (EVI) and automated Graded Response Action Plan (GRAP) decision-support matrix.</w:t>
       </w:r>
     </w:p>
-    <w:bookmarkEnd w:id="130"/>
-    <w:bookmarkStart w:id="131" w:name="overall-evaluation"/>
     <w:p>
       <w:pPr>
         <w:pStyle w:val="Heading2"/>
       </w:pPr>
+      <w:bookmarkStart w:id="132" w:name="_5fcd06381fce153a10e034e7ef3d9a74c639538"/>
       <w:r>
         <w:rPr>
           <w:rStyle w:val="SectionNumber"/>
@@ -19410,6 +19324,7 @@
       <w:r>
         <w:t xml:space="preserve">8.2 Overall Evaluation</w:t>
       </w:r>
+      <w:bookmarkEnd w:id="132"/>
     </w:p>
     <w:p>
       <w:pPr>
@@ -19419,13 +19334,11 @@
         <w:t xml:space="preserve">The system establishes a transparent, reproducible benchmark for environmental analytics. By embedding data quality audits, outlier flags, and multi-grain reconciliation into the core code, AIRGUARD 360 bridges the gap between academic data science and real-world civic decision-making.</w:t>
       </w:r>
     </w:p>
-    <w:bookmarkEnd w:id="131"/>
-    <w:bookmarkEnd w:id="132"/>
-    <w:bookmarkStart w:id="133" w:name="future-scope-roadmap"/>
     <w:p>
       <w:pPr>
         <w:pStyle w:val="Heading1"/>
       </w:pPr>
+      <w:bookmarkStart w:id="133" w:name="_174c91215842862deadc60910327699704e9e73"/>
       <w:r>
         <w:rPr>
           <w:rStyle w:val="SectionNumber"/>
@@ -19438,6 +19351,7 @@
       <w:r>
         <w:t xml:space="preserve">9. FUTURE SCOPE &amp; ROADMAP</w:t>
       </w:r>
+      <w:bookmarkEnd w:id="133"/>
     </w:p>
     <w:p>
       <w:pPr>
@@ -19715,12 +19629,11 @@
         </w:tc>
       </w:tr>
     </w:tbl>
-    <w:bookmarkEnd w:id="133"/>
-    <w:bookmarkStart w:id="136" w:name="references-bibliography"/>
     <w:p>
       <w:pPr>
         <w:pStyle w:val="Heading1"/>
       </w:pPr>
+      <w:bookmarkStart w:id="134" w:name="_792e75f90da3ceeca74d7ad24f1dc55a2fa2cca"/>
       <w:r>
         <w:rPr>
           <w:rStyle w:val="SectionNumber"/>
@@ -19733,6 +19646,7 @@
       <w:r>
         <w:t xml:space="preserve">10. REFERENCES &amp; BIBLIOGRAPHY</w:t>
       </w:r>
+      <w:bookmarkEnd w:id="134"/>
     </w:p>
     <w:p>
       <w:pPr>
@@ -19836,7 +19750,7 @@
       <w:r>
         <w:t xml:space="preserve"> </w:t>
       </w:r>
-      <w:hyperlink r:id="rId134">
+      <w:hyperlink r:id="rId135">
         <w:r>
           <w:rPr>
             <w:rStyle w:val="Hyperlink"/>
@@ -20003,7 +19917,7 @@
       <w:r>
         <w:t xml:space="preserve"> </w:t>
       </w:r>
-      <w:hyperlink r:id="rId135">
+      <w:hyperlink r:id="rId136">
         <w:r>
           <w:rPr>
             <w:rStyle w:val="Hyperlink"/>
@@ -20015,12 +19929,11 @@
         <w:t xml:space="preserve">.</w:t>
       </w:r>
     </w:p>
-    <w:bookmarkEnd w:id="136"/>
-    <w:bookmarkStart w:id="139" w:name="Xe8da9b43e1bf15377fd8ec349134dcad70f7b02"/>
     <w:p>
       <w:pPr>
         <w:pStyle w:val="Heading1"/>
       </w:pPr>
+      <w:bookmarkStart w:id="137" w:name="_e8da9b43e1bf15377fd8ec349134dcad70f7b02"/>
       <w:r>
         <w:rPr>
           <w:rStyle w:val="SectionNumber"/>
@@ -20033,12 +19946,13 @@
       <w:r>
         <w:t xml:space="preserve">11. PROJECT RESOURCES, VERIFICATION SUITE &amp; RUN GUIDE</w:t>
       </w:r>
-    </w:p>
-    <w:bookmarkStart w:id="137" w:name="file-manifest-in-submitted-bundle"/>
+      <w:bookmarkEnd w:id="137"/>
+    </w:p>
     <w:p>
       <w:pPr>
         <w:pStyle w:val="Heading2"/>
       </w:pPr>
+      <w:bookmarkStart w:id="138" w:name="_43c9e4687b1512340092cf08b1bbee745862f52"/>
       <w:r>
         <w:rPr>
           <w:rStyle w:val="SectionNumber"/>
@@ -20051,6 +19965,7 @@
       <w:r>
         <w:t xml:space="preserve">11.1 File Manifest in Submitted Bundle</w:t>
       </w:r>
+      <w:bookmarkEnd w:id="138"/>
     </w:p>
     <w:p>
       <w:pPr>
@@ -20369,12 +20284,11 @@
         <w:t xml:space="preserve">└── .gitignore                   # Version control exclusions</w:t>
       </w:r>
     </w:p>
-    <w:bookmarkEnd w:id="137"/>
-    <w:bookmarkStart w:id="138" w:name="reproduction-execution-guide"/>
     <w:p>
       <w:pPr>
         <w:pStyle w:val="Heading2"/>
       </w:pPr>
+      <w:bookmarkStart w:id="139" w:name="_3e6e4399c7ff3821da86906f940367f4d8cb1ef"/>
       <w:r>
         <w:rPr>
           <w:rStyle w:val="SectionNumber"/>
@@ -20387,6 +20301,7 @@
       <w:r>
         <w:t xml:space="preserve">11.2 Reproduction &amp; Execution Guide</w:t>
       </w:r>
+      <w:bookmarkEnd w:id="139"/>
     </w:p>
     <w:p>
       <w:pPr>
@@ -20625,16 +20540,15 @@
         <w:t xml:space="preserve">)</w:t>
       </w:r>
     </w:p>
-    <w:bookmarkEnd w:id="138"/>
-    <w:bookmarkEnd w:id="139"/>
-    <w:bookmarkStart w:id="140" w:name="X57c6bd8855f1e8402cc00716a77b85b0e88f13e"/>
     <w:p>
       <w:pPr>
         <w:pStyle w:val="Heading1"/>
       </w:pPr>
+      <w:bookmarkStart w:id="140" w:name="_57c6bd8855f1e8402cc00716a77b85b0e88f13e"/>
       <w:r>
         <w:t xml:space="preserve">APPENDIX A: METRIC, PARAMETER &amp; FIELD GLOSSARY</w:t>
       </w:r>
+      <w:bookmarkEnd w:id="140"/>
     </w:p>
     <w:p>
       <w:pPr>
@@ -21212,7 +21126,6 @@
         </w:tc>
       </w:tr>
     </w:tbl>
-    <w:bookmarkEnd w:id="140"/>
     <w:sectPr>
       <w:footnotePr>
         <w:numRestart w:val="eachSect"/>
@@ -22144,10 +22057,10 @@
   <w:docDefaults>
     <w:rPrDefault>
       <w:rPr>
-        <w:rFonts w:asciiTheme="minorHAnsi" w:cstheme="minorBidi" w:eastAsiaTheme="minorEastAsia" w:hAnsiTheme="minorHAnsi"/>
+        <w:rFonts w:asciiTheme="minorHAnsi" w:eastAsiaTheme="minorEastAsia" w:hAnsiTheme="minorHAnsi" w:cstheme="minorBidi"/>
         <w:sz w:val="24"/>
         <w:szCs w:val="24"/>
-        <w:lang w:bidi="ar-SA" w:eastAsia="zh-CN" w:val="en-US"/>
+        <w:lang w:val="en-US" w:eastAsia="zh-CN" w:bidi="ar-SA"/>
       </w:rPr>
     </w:rPrDefault>
     <w:pPrDefault>
@@ -22156,35 +22069,35 @@
       </w:pPr>
     </w:pPrDefault>
   </w:docDefaults>
-  <w:latentStyles w:count="276" w:defLockedState="0" w:defQFormat="0" w:defSemiHidden="0" w:defUIPriority="0" w:defUnhideWhenUsed="0"/>
-  <w:style w:default="1" w:styleId="Normal" w:type="paragraph">
+  <w:latentStyles w:defLockedState="0" w:defUIPriority="0" w:defSemiHidden="0" w:defUnhideWhenUsed="0" w:defQFormat="0" w:count="276"/>
+  <w:style w:type="paragraph" w:default="1" w:styleId="Normal">
     <w:name w:val="Normal"/>
     <w:qFormat/>
   </w:style>
-  <w:style w:styleId="BodyText" w:type="paragraph">
+  <w:style w:type="paragraph" w:styleId="BodyText">
     <w:name w:val="Body Text"/>
     <w:basedOn w:val="Normal"/>
     <w:link w:val="BodyTextChar"/>
     <w:qFormat/>
     <w:pPr>
-      <w:spacing w:after="180" w:before="180"/>
+      <w:spacing w:before="180" w:after="180"/>
     </w:pPr>
   </w:style>
-  <w:style w:customStyle="1" w:styleId="FirstParagraph" w:type="paragraph">
+  <w:style w:type="paragraph" w:customStyle="1" w:styleId="FirstParagraph">
     <w:name w:val="First Paragraph"/>
     <w:basedOn w:val="BodyText"/>
     <w:next w:val="BodyText"/>
     <w:qFormat/>
   </w:style>
-  <w:style w:customStyle="1" w:styleId="Compact" w:type="paragraph">
+  <w:style w:type="paragraph" w:customStyle="1" w:styleId="Compact">
     <w:name w:val="Compact"/>
     <w:basedOn w:val="BodyText"/>
     <w:qFormat/>
     <w:pPr>
-      <w:spacing w:after="36" w:before="36"/>
+      <w:spacing w:before="36" w:after="36"/>
     </w:pPr>
   </w:style>
-  <w:style w:styleId="Title" w:type="paragraph">
+  <w:style w:type="paragraph" w:styleId="Title">
     <w:name w:val="Title"/>
     <w:basedOn w:val="Normal"/>
     <w:next w:val="BodyText"/>
@@ -22198,24 +22111,24 @@
       <w:jc w:val="center"/>
     </w:pPr>
     <w:rPr>
-      <w:rFonts w:asciiTheme="majorHAnsi" w:cstheme="majorBidi" w:eastAsiaTheme="majorEastAsia" w:hAnsiTheme="majorHAnsi"/>
+      <w:rFonts w:asciiTheme="majorHAnsi" w:eastAsiaTheme="majorEastAsia" w:hAnsiTheme="majorHAnsi" w:cstheme="majorBidi"/>
       <w:sz w:val="56"/>
       <w:szCs w:val="56"/>
     </w:rPr>
   </w:style>
-  <w:style w:customStyle="1" w:styleId="TitleChar" w:type="character">
+  <w:style w:type="character" w:customStyle="1" w:styleId="TitleChar">
     <w:name w:val="Title Char"/>
     <w:basedOn w:val="DefaultParagraphFont"/>
     <w:link w:val="Title"/>
     <w:uiPriority w:val="10"/>
     <w:rsid w:val="00A10FD9"/>
     <w:rPr>
-      <w:rFonts w:asciiTheme="majorHAnsi" w:cstheme="majorBidi" w:eastAsiaTheme="majorEastAsia" w:hAnsiTheme="majorHAnsi"/>
+      <w:rFonts w:asciiTheme="majorHAnsi" w:eastAsiaTheme="majorEastAsia" w:hAnsiTheme="majorHAnsi" w:cstheme="majorBidi"/>
       <w:sz w:val="56"/>
       <w:szCs w:val="56"/>
     </w:rPr>
   </w:style>
-  <w:style w:styleId="Subtitle" w:type="paragraph">
+  <w:style w:type="paragraph" w:styleId="Subtitle">
     <w:name w:val="Subtitle"/>
     <w:basedOn w:val="Title"/>
     <w:next w:val="BodyText"/>
@@ -22229,27 +22142,27 @@
       </w:numPr>
     </w:pPr>
     <w:rPr>
-      <w:rFonts w:cstheme="majorBidi" w:eastAsiaTheme="majorEastAsia"/>
+      <w:rFonts w:eastAsiaTheme="majorEastAsia" w:cstheme="majorBidi"/>
       <w:spacing w:val="15"/>
       <w:sz w:val="28"/>
       <w:szCs w:val="28"/>
     </w:rPr>
   </w:style>
-  <w:style w:customStyle="1" w:styleId="SubtitleChar" w:type="character">
+  <w:style w:type="character" w:customStyle="1" w:styleId="SubtitleChar">
     <w:name w:val="Subtitle Char"/>
     <w:basedOn w:val="DefaultParagraphFont"/>
     <w:link w:val="Subtitle"/>
     <w:uiPriority w:val="11"/>
     <w:rsid w:val="00A10FD9"/>
     <w:rPr>
-      <w:rFonts w:cstheme="majorBidi" w:eastAsiaTheme="majorEastAsia"/>
-      <w:color w:themeColor="text1" w:themeTint="A6" w:val="595959"/>
+      <w:rFonts w:eastAsiaTheme="majorEastAsia" w:cstheme="majorBidi"/>
+      <w:color w:val="595959" w:themeColor="text1" w:themeTint="A6"/>
       <w:spacing w:val="15"/>
       <w:sz w:val="28"/>
       <w:szCs w:val="28"/>
     </w:rPr>
   </w:style>
-  <w:style w:customStyle="1" w:styleId="Author" w:type="paragraph">
+  <w:style w:type="paragraph" w:customStyle="1" w:styleId="Author">
     <w:name w:val="Author"/>
     <w:basedOn w:val="Title"/>
     <w:next w:val="BodyText"/>
@@ -22263,7 +22176,7 @@
       <w:szCs w:val="24"/>
     </w:rPr>
   </w:style>
-  <w:style w:styleId="Date" w:type="paragraph">
+  <w:style w:type="paragraph" w:styleId="Date">
     <w:name w:val="Date"/>
     <w:basedOn w:val="Title"/>
     <w:next w:val="BodyText"/>
@@ -22277,7 +22190,7 @@
       <w:szCs w:val="24"/>
     </w:rPr>
   </w:style>
-  <w:style w:customStyle="1" w:styleId="AbstractTitle" w:type="paragraph">
+  <w:style w:type="paragraph" w:customStyle="1" w:styleId="AbstractTitle">
     <w:name w:val="Abstract Title"/>
     <w:basedOn w:val="Normal"/>
     <w:next w:val="Abstract"/>
@@ -22285,7 +22198,7 @@
     <w:pPr>
       <w:keepNext/>
       <w:keepLines/>
-      <w:spacing w:after="0" w:before="300"/>
+      <w:spacing w:before="300" w:after="0"/>
       <w:jc w:val="center"/>
     </w:pPr>
     <w:rPr>
@@ -22294,7 +22207,7 @@
       <w:szCs w:val="20"/>
     </w:rPr>
   </w:style>
-  <w:style w:customStyle="1" w:styleId="Abstract" w:type="paragraph">
+  <w:style w:type="paragraph" w:customStyle="1" w:styleId="Abstract">
     <w:name w:val="Abstract"/>
     <w:basedOn w:val="Normal"/>
     <w:next w:val="BodyText"/>
@@ -22302,14 +22215,14 @@
     <w:pPr>
       <w:keepNext/>
       <w:keepLines/>
-      <w:spacing w:after="300" w:before="100"/>
+      <w:spacing w:before="100" w:after="300"/>
     </w:pPr>
     <w:rPr>
       <w:sz w:val="20"/>
       <w:szCs w:val="20"/>
     </w:rPr>
   </w:style>
-  <w:style w:styleId="Bibliography" w:type="paragraph">
+  <w:style w:type="paragraph" w:styleId="Bibliography">
     <w:name w:val="Bibliography"/>
     <w:basedOn w:val="Normal"/>
     <w:next w:val="Bibliography"/>
@@ -22317,7 +22230,7 @@
     <w:pPr/>
     <w:rPr/>
   </w:style>
-  <w:style w:styleId="Heading1" w:type="paragraph">
+  <w:style w:type="paragraph" w:styleId="Heading1">
     <w:name w:val="heading 1"/>
     <w:basedOn w:val="Normal"/>
     <w:next w:val="BodyText"/>
@@ -22328,17 +22241,17 @@
     <w:pPr>
       <w:keepNext/>
       <w:keepLines/>
-      <w:spacing w:after="80" w:before="360"/>
+      <w:spacing w:before="360" w:after="80"/>
       <w:outlineLvl w:val="0"/>
     </w:pPr>
     <w:rPr>
-      <w:rFonts w:asciiTheme="majorHAnsi" w:cstheme="majorBidi" w:eastAsiaTheme="majorEastAsia" w:hAnsiTheme="majorHAnsi"/>
-      <w:color w:themeColor="accent1" w:themeShade="BF" w:val="0F4761"/>
+      <w:rFonts w:asciiTheme="majorHAnsi" w:eastAsiaTheme="majorEastAsia" w:hAnsiTheme="majorHAnsi" w:cstheme="majorBidi"/>
+      <w:color w:val="0F4761" w:themeColor="accent1" w:themeShade="BF"/>
       <w:sz w:val="40"/>
       <w:szCs w:val="40"/>
     </w:rPr>
   </w:style>
-  <w:style w:styleId="Heading2" w:type="paragraph">
+  <w:style w:type="paragraph" w:styleId="Heading2">
     <w:name w:val="heading 2"/>
     <w:basedOn w:val="Normal"/>
     <w:next w:val="BodyText"/>
@@ -22351,17 +22264,17 @@
     <w:pPr>
       <w:keepNext/>
       <w:keepLines/>
-      <w:spacing w:after="80" w:before="160"/>
+      <w:spacing w:before="160" w:after="80"/>
       <w:outlineLvl w:val="1"/>
     </w:pPr>
     <w:rPr>
-      <w:rFonts w:asciiTheme="majorHAnsi" w:cstheme="majorBidi" w:eastAsiaTheme="majorEastAsia" w:hAnsiTheme="majorHAnsi"/>
-      <w:color w:themeColor="accent1" w:themeShade="BF" w:val="0F4761"/>
+      <w:rFonts w:asciiTheme="majorHAnsi" w:eastAsiaTheme="majorEastAsia" w:hAnsiTheme="majorHAnsi" w:cstheme="majorBidi"/>
+      <w:color w:val="0F4761" w:themeColor="accent1" w:themeShade="BF"/>
       <w:sz w:val="32"/>
       <w:szCs w:val="32"/>
     </w:rPr>
   </w:style>
-  <w:style w:styleId="Heading3" w:type="paragraph">
+  <w:style w:type="paragraph" w:styleId="Heading3">
     <w:name w:val="heading 3"/>
     <w:basedOn w:val="Normal"/>
     <w:next w:val="BodyText"/>
@@ -22374,17 +22287,17 @@
     <w:pPr>
       <w:keepNext/>
       <w:keepLines/>
-      <w:spacing w:after="80" w:before="160"/>
+      <w:spacing w:before="160" w:after="80"/>
       <w:outlineLvl w:val="2"/>
     </w:pPr>
     <w:rPr>
-      <w:rFonts w:cstheme="majorBidi" w:eastAsiaTheme="majorEastAsia"/>
-      <w:color w:themeColor="accent1" w:themeShade="BF" w:val="0F4761"/>
+      <w:rFonts w:eastAsiaTheme="majorEastAsia" w:cstheme="majorBidi"/>
+      <w:color w:val="0F4761" w:themeColor="accent1" w:themeShade="BF"/>
       <w:sz w:val="28"/>
       <w:szCs w:val="28"/>
     </w:rPr>
   </w:style>
-  <w:style w:styleId="Heading4" w:type="paragraph">
+  <w:style w:type="paragraph" w:styleId="Heading4">
     <w:name w:val="heading 4"/>
     <w:basedOn w:val="Normal"/>
     <w:next w:val="BodyText"/>
@@ -22397,17 +22310,17 @@
     <w:pPr>
       <w:keepNext/>
       <w:keepLines/>
-      <w:spacing w:after="40" w:before="80"/>
+      <w:spacing w:before="80" w:after="40"/>
       <w:outlineLvl w:val="3"/>
     </w:pPr>
     <w:rPr>
-      <w:rFonts w:cstheme="majorBidi" w:eastAsiaTheme="majorEastAsia"/>
+      <w:rFonts w:eastAsiaTheme="majorEastAsia" w:cstheme="majorBidi"/>
       <w:i/>
       <w:iCs/>
-      <w:color w:themeColor="accent1" w:themeShade="BF" w:val="0F4761"/>
+      <w:color w:val="0F4761" w:themeColor="accent1" w:themeShade="BF"/>
     </w:rPr>
   </w:style>
-  <w:style w:styleId="Heading5" w:type="paragraph">
+  <w:style w:type="paragraph" w:styleId="Heading5">
     <w:name w:val="heading 5"/>
     <w:basedOn w:val="Normal"/>
     <w:next w:val="BodyText"/>
@@ -22420,15 +22333,15 @@
     <w:pPr>
       <w:keepNext/>
       <w:keepLines/>
-      <w:spacing w:after="40" w:before="80"/>
+      <w:spacing w:before="80" w:after="40"/>
       <w:outlineLvl w:val="4"/>
     </w:pPr>
     <w:rPr>
-      <w:rFonts w:cstheme="majorBidi" w:eastAsiaTheme="majorEastAsia"/>
-      <w:color w:themeColor="accent1" w:themeShade="BF" w:val="0F4761"/>
+      <w:rFonts w:eastAsiaTheme="majorEastAsia" w:cstheme="majorBidi"/>
+      <w:color w:val="0F4761" w:themeColor="accent1" w:themeShade="BF"/>
     </w:rPr>
   </w:style>
-  <w:style w:styleId="Heading6" w:type="paragraph">
+  <w:style w:type="paragraph" w:styleId="Heading6">
     <w:name w:val="heading 6"/>
     <w:basedOn w:val="Normal"/>
     <w:next w:val="BodyText"/>
@@ -22441,17 +22354,17 @@
     <w:pPr>
       <w:keepNext/>
       <w:keepLines/>
-      <w:spacing w:after="0" w:before="40"/>
+      <w:spacing w:before="40" w:after="0"/>
       <w:outlineLvl w:val="5"/>
     </w:pPr>
     <w:rPr>
-      <w:rFonts w:cstheme="majorBidi" w:eastAsiaTheme="majorEastAsia"/>
+      <w:rFonts w:eastAsiaTheme="majorEastAsia" w:cstheme="majorBidi"/>
       <w:i/>
       <w:iCs/>
-      <w:color w:themeColor="text1" w:themeTint="A6" w:val="595959"/>
+      <w:color w:val="595959" w:themeColor="text1" w:themeTint="A6"/>
     </w:rPr>
   </w:style>
-  <w:style w:styleId="Heading7" w:type="paragraph">
+  <w:style w:type="paragraph" w:styleId="Heading7">
     <w:name w:val="heading 7"/>
     <w:basedOn w:val="Normal"/>
     <w:next w:val="BodyText"/>
@@ -22464,15 +22377,15 @@
     <w:pPr>
       <w:keepNext/>
       <w:keepLines/>
-      <w:spacing w:after="0" w:before="40"/>
+      <w:spacing w:before="40" w:after="0"/>
       <w:outlineLvl w:val="6"/>
     </w:pPr>
     <w:rPr>
-      <w:rFonts w:cstheme="majorBidi" w:eastAsiaTheme="majorEastAsia"/>
-      <w:color w:themeColor="text1" w:themeTint="A6" w:val="595959"/>
+      <w:rFonts w:eastAsiaTheme="majorEastAsia" w:cstheme="majorBidi"/>
+      <w:color w:val="595959" w:themeColor="text1" w:themeTint="A6"/>
     </w:rPr>
   </w:style>
-  <w:style w:styleId="Heading8" w:type="paragraph">
+  <w:style w:type="paragraph" w:styleId="Heading8">
     <w:name w:val="heading 8"/>
     <w:basedOn w:val="Normal"/>
     <w:next w:val="BodyText"/>
@@ -22489,13 +22402,13 @@
       <w:outlineLvl w:val="7"/>
     </w:pPr>
     <w:rPr>
-      <w:rFonts w:cstheme="majorBidi" w:eastAsiaTheme="majorEastAsia"/>
+      <w:rFonts w:eastAsiaTheme="majorEastAsia" w:cstheme="majorBidi"/>
       <w:i/>
       <w:iCs/>
-      <w:color w:themeColor="text1" w:themeTint="D8" w:val="272727"/>
+      <w:color w:val="272727" w:themeColor="text1" w:themeTint="D8"/>
     </w:rPr>
   </w:style>
-  <w:style w:styleId="Heading9" w:type="paragraph">
+  <w:style w:type="paragraph" w:styleId="Heading9">
     <w:name w:val="heading 9"/>
     <w:basedOn w:val="Normal"/>
     <w:next w:val="BodyText"/>
@@ -22512,24 +22425,24 @@
       <w:outlineLvl w:val="8"/>
     </w:pPr>
     <w:rPr>
-      <w:rFonts w:cstheme="majorBidi" w:eastAsiaTheme="majorEastAsia"/>
-      <w:color w:themeColor="text1" w:themeTint="D8" w:val="272727"/>
+      <w:rFonts w:eastAsiaTheme="majorEastAsia" w:cstheme="majorBidi"/>
+      <w:color w:val="272727" w:themeColor="text1" w:themeTint="D8"/>
     </w:rPr>
   </w:style>
-  <w:style w:customStyle="1" w:styleId="Heading1Char" w:type="character">
+  <w:style w:type="character" w:customStyle="1" w:styleId="Heading1Char">
     <w:name w:val="Heading 1 Char"/>
     <w:basedOn w:val="DefaultParagraphFont"/>
     <w:link w:val="Heading1"/>
     <w:uiPriority w:val="9"/>
     <w:rsid w:val="00A10FD9"/>
     <w:rPr>
-      <w:rFonts w:asciiTheme="majorHAnsi" w:cstheme="majorBidi" w:eastAsiaTheme="majorEastAsia" w:hAnsiTheme="majorHAnsi"/>
-      <w:color w:themeColor="accent1" w:themeShade="BF" w:val="0F4761"/>
+      <w:rFonts w:asciiTheme="majorHAnsi" w:eastAsiaTheme="majorEastAsia" w:hAnsiTheme="majorHAnsi" w:cstheme="majorBidi"/>
+      <w:color w:val="0F4761" w:themeColor="accent1" w:themeShade="BF"/>
       <w:sz w:val="40"/>
       <w:szCs w:val="40"/>
     </w:rPr>
   </w:style>
-  <w:style w:customStyle="1" w:styleId="Heading2Char" w:type="character">
+  <w:style w:type="character" w:customStyle="1" w:styleId="Heading2Char">
     <w:name w:val="Heading 2 Char"/>
     <w:basedOn w:val="DefaultParagraphFont"/>
     <w:link w:val="Heading2"/>
@@ -22537,13 +22450,13 @@
     <w:semiHidden/>
     <w:rsid w:val="00A10FD9"/>
     <w:rPr>
-      <w:rFonts w:asciiTheme="majorHAnsi" w:cstheme="majorBidi" w:eastAsiaTheme="majorEastAsia" w:hAnsiTheme="majorHAnsi"/>
-      <w:color w:themeColor="accent1" w:themeShade="BF" w:val="0F4761"/>
+      <w:rFonts w:asciiTheme="majorHAnsi" w:eastAsiaTheme="majorEastAsia" w:hAnsiTheme="majorHAnsi" w:cstheme="majorBidi"/>
+      <w:color w:val="0F4761" w:themeColor="accent1" w:themeShade="BF"/>
       <w:sz w:val="32"/>
       <w:szCs w:val="32"/>
     </w:rPr>
   </w:style>
-  <w:style w:customStyle="1" w:styleId="Heading3Char" w:type="character">
+  <w:style w:type="character" w:customStyle="1" w:styleId="Heading3Char">
     <w:name w:val="Heading 3 Char"/>
     <w:basedOn w:val="DefaultParagraphFont"/>
     <w:link w:val="Heading3"/>
@@ -22551,13 +22464,13 @@
     <w:semiHidden/>
     <w:rsid w:val="00A10FD9"/>
     <w:rPr>
-      <w:rFonts w:cstheme="majorBidi" w:eastAsiaTheme="majorEastAsia"/>
-      <w:color w:themeColor="accent1" w:themeShade="BF" w:val="0F4761"/>
+      <w:rFonts w:eastAsiaTheme="majorEastAsia" w:cstheme="majorBidi"/>
+      <w:color w:val="0F4761" w:themeColor="accent1" w:themeShade="BF"/>
       <w:sz w:val="28"/>
       <w:szCs w:val="28"/>
     </w:rPr>
   </w:style>
-  <w:style w:customStyle="1" w:styleId="Heading4Char" w:type="character">
+  <w:style w:type="character" w:customStyle="1" w:styleId="Heading4Char">
     <w:name w:val="Heading 4 Char"/>
     <w:basedOn w:val="DefaultParagraphFont"/>
     <w:link w:val="Heading4"/>
@@ -22565,13 +22478,13 @@
     <w:semiHidden/>
     <w:rsid w:val="00A10FD9"/>
     <w:rPr>
-      <w:rFonts w:cstheme="majorBidi" w:eastAsiaTheme="majorEastAsia"/>
+      <w:rFonts w:eastAsiaTheme="majorEastAsia" w:cstheme="majorBidi"/>
       <w:i/>
       <w:iCs/>
-      <w:color w:themeColor="accent1" w:themeShade="BF" w:val="0F4761"/>
+      <w:color w:val="0F4761" w:themeColor="accent1" w:themeShade="BF"/>
     </w:rPr>
   </w:style>
-  <w:style w:customStyle="1" w:styleId="Heading5Char" w:type="character">
+  <w:style w:type="character" w:customStyle="1" w:styleId="Heading5Char">
     <w:name w:val="Heading 5 Char"/>
     <w:basedOn w:val="DefaultParagraphFont"/>
     <w:link w:val="Heading5"/>
@@ -22579,11 +22492,11 @@
     <w:semiHidden/>
     <w:rsid w:val="00A10FD9"/>
     <w:rPr>
-      <w:rFonts w:cstheme="majorBidi" w:eastAsiaTheme="majorEastAsia"/>
-      <w:color w:themeColor="accent1" w:themeShade="BF" w:val="0F4761"/>
+      <w:rFonts w:eastAsiaTheme="majorEastAsia" w:cstheme="majorBidi"/>
+      <w:color w:val="0F4761" w:themeColor="accent1" w:themeShade="BF"/>
     </w:rPr>
   </w:style>
-  <w:style w:customStyle="1" w:styleId="Heading6Char" w:type="character">
+  <w:style w:type="character" w:customStyle="1" w:styleId="Heading6Char">
     <w:name w:val="Heading 6 Char"/>
     <w:basedOn w:val="DefaultParagraphFont"/>
     <w:link w:val="Heading6"/>
@@ -22591,13 +22504,13 @@
     <w:semiHidden/>
     <w:rsid w:val="00A10FD9"/>
     <w:rPr>
-      <w:rFonts w:cstheme="majorBidi" w:eastAsiaTheme="majorEastAsia"/>
+      <w:rFonts w:eastAsiaTheme="majorEastAsia" w:cstheme="majorBidi"/>
       <w:i/>
       <w:iCs/>
-      <w:color w:themeColor="text1" w:themeTint="A6" w:val="595959"/>
+      <w:color w:val="595959" w:themeColor="text1" w:themeTint="A6"/>
     </w:rPr>
   </w:style>
-  <w:style w:customStyle="1" w:styleId="Heading7Char" w:type="character">
+  <w:style w:type="character" w:customStyle="1" w:styleId="Heading7Char">
     <w:name w:val="Heading 7 Char"/>
     <w:basedOn w:val="DefaultParagraphFont"/>
     <w:link w:val="Heading7"/>
@@ -22605,11 +22518,11 @@
     <w:semiHidden/>
     <w:rsid w:val="00A10FD9"/>
     <w:rPr>
-      <w:rFonts w:cstheme="majorBidi" w:eastAsiaTheme="majorEastAsia"/>
-      <w:color w:themeColor="text1" w:themeTint="A6" w:val="595959"/>
+      <w:rFonts w:eastAsiaTheme="majorEastAsia" w:cstheme="majorBidi"/>
+      <w:color w:val="595959" w:themeColor="text1" w:themeTint="A6"/>
     </w:rPr>
   </w:style>
-  <w:style w:customStyle="1" w:styleId="Heading8Char" w:type="character">
+  <w:style w:type="character" w:customStyle="1" w:styleId="Heading8Char">
     <w:name w:val="Heading 8 Char"/>
     <w:basedOn w:val="DefaultParagraphFont"/>
     <w:link w:val="Heading8"/>
@@ -22617,13 +22530,13 @@
     <w:semiHidden/>
     <w:rsid w:val="00A10FD9"/>
     <w:rPr>
-      <w:rFonts w:cstheme="majorBidi" w:eastAsiaTheme="majorEastAsia"/>
+      <w:rFonts w:eastAsiaTheme="majorEastAsia" w:cstheme="majorBidi"/>
       <w:i/>
       <w:iCs/>
-      <w:color w:themeColor="text1" w:themeTint="D8" w:val="272727"/>
+      <w:color w:val="272727" w:themeColor="text1" w:themeTint="D8"/>
     </w:rPr>
   </w:style>
-  <w:style w:customStyle="1" w:styleId="Heading9Char" w:type="character">
+  <w:style w:type="character" w:customStyle="1" w:styleId="Heading9Char">
     <w:name w:val="Heading 9 Char"/>
     <w:basedOn w:val="DefaultParagraphFont"/>
     <w:link w:val="Heading9"/>
@@ -22631,11 +22544,11 @@
     <w:semiHidden/>
     <w:rsid w:val="00A10FD9"/>
     <w:rPr>
-      <w:rFonts w:cstheme="majorBidi" w:eastAsiaTheme="majorEastAsia"/>
-      <w:color w:themeColor="text1" w:themeTint="D8" w:val="272727"/>
+      <w:rFonts w:eastAsiaTheme="majorEastAsia" w:cstheme="majorBidi"/>
+      <w:color w:val="272727" w:themeColor="text1" w:themeTint="D8"/>
     </w:rPr>
   </w:style>
-  <w:style w:styleId="BlockText" w:type="paragraph">
+  <w:style w:type="paragraph" w:styleId="BlockText">
     <w:name w:val="Block Text"/>
     <w:basedOn w:val="BodyText"/>
     <w:next w:val="BodyText"/>
@@ -22643,11 +22556,11 @@
     <w:unhideWhenUsed/>
     <w:qFormat/>
     <w:pPr>
-      <w:spacing w:after="100" w:before="100"/>
+      <w:spacing w:before="100" w:after="100"/>
       <w:ind w:firstLine="0" w:left="480" w:right="480"/>
     </w:pPr>
   </w:style>
-  <w:style w:styleId="FootnoteText" w:type="paragraph">
+  <w:style w:type="paragraph" w:styleId="FootnoteText">
     <w:name w:val="Footnote Text"/>
     <w:basedOn w:val="Normal"/>
     <w:next w:val="FootnoteText"/>
@@ -22655,7 +22568,7 @@
     <w:unhideWhenUsed/>
     <w:qFormat/>
   </w:style>
-  <w:style w:styleId="FootnoteBlockText" w:type="paragraph">
+  <w:style w:type="paragraph" w:styleId="FootnoteBlockText">
     <w:name w:val="Footnote Block Text"/>
     <w:basedOn w:val="FootnoteText"/>
     <w:next w:val="FootnoteText"/>
@@ -22663,28 +22576,26 @@
     <w:unhideWhenUsed/>
     <w:qFormat/>
     <w:pPr>
-      <w:spacing w:after="100" w:before="100"/>
+      <w:spacing w:before="100" w:after="100"/>
       <w:ind w:firstLine="0" w:left="480" w:right="480"/>
     </w:pPr>
   </w:style>
-  <w:style w:default="1" w:styleId="DefaultParagraphFont" w:type="character">
+  <w:style w:type="character" w:default="1" w:styleId="DefaultParagraphFont">
     <w:name w:val="Default Paragraph Font"/>
     <w:semiHidden/>
     <w:unhideWhenUsed/>
   </w:style>
-  <w:style w:default="1" w:styleId="Table" w:type="table">
+  <w:style w:type="table" w:default="1" w:styleId="Table">
     <w:name w:val="Table"/>
     <w:basedOn w:val="TableNormal"/>
-    <w:semiHidden/>
-    <w:unhideWhenUsed/>
     <w:qFormat/>
     <w:tblPr>
-      <w:tblInd w:type="dxa" w:w="0"/>
+      <w:tblInd w:w="0" w:type="dxa"/>
       <w:tblCellMar>
-        <w:top w:type="dxa" w:w="0"/>
-        <w:left w:type="dxa" w:w="108"/>
-        <w:bottom w:type="dxa" w:w="0"/>
-        <w:right w:type="dxa" w:w="108"/>
+        <w:top w:w="0" w:type="dxa"/>
+        <w:left w:w="108" w:type="dxa"/>
+        <w:bottom w:w="0" w:type="dxa"/>
+        <w:right w:w="108" w:type="dxa"/>
       </w:tblCellMar>
     </w:tblPr>
     <w:tblStylePr w:type="firstRow">
@@ -22696,7 +22607,7 @@
       </w:tcPr>
     </w:tblStylePr>
   </w:style>
-  <w:style w:customStyle="1" w:styleId="DefinitionTerm" w:type="paragraph">
+  <w:style w:type="paragraph" w:customStyle="1" w:styleId="DefinitionTerm">
     <w:name w:val="Definition Term"/>
     <w:basedOn w:val="Normal"/>
     <w:next w:val="Definition"/>
@@ -22709,49 +22620,49 @@
       <w:b/>
     </w:rPr>
   </w:style>
-  <w:style w:customStyle="1" w:styleId="Definition" w:type="paragraph">
+  <w:style w:type="paragraph" w:customStyle="1" w:styleId="Definition">
     <w:name w:val="Definition"/>
     <w:basedOn w:val="Normal"/>
   </w:style>
-  <w:style w:styleId="Caption" w:type="paragraph">
+  <w:style w:type="paragraph" w:styleId="Caption">
     <w:name w:val="Caption"/>
     <w:basedOn w:val="Normal"/>
     <w:link w:val="BodyTextChar"/>
     <w:pPr>
-      <w:spacing w:after="120" w:before="0"/>
+      <w:spacing w:before="0" w:after="120"/>
     </w:pPr>
     <w:rPr>
       <w:i/>
     </w:rPr>
   </w:style>
-  <w:style w:customStyle="1" w:styleId="TableCaption" w:type="paragraph">
+  <w:style w:type="paragraph" w:customStyle="1" w:styleId="TableCaption">
     <w:name w:val="Table Caption"/>
     <w:basedOn w:val="Caption"/>
     <w:pPr>
       <w:keepNext/>
     </w:pPr>
   </w:style>
-  <w:style w:customStyle="1" w:styleId="ImageCaption" w:type="paragraph">
+  <w:style w:type="paragraph" w:customStyle="1" w:styleId="ImageCaption">
     <w:name w:val="Image Caption"/>
     <w:basedOn w:val="Caption"/>
   </w:style>
-  <w:style w:customStyle="1" w:styleId="Figure" w:type="paragraph">
+  <w:style w:type="paragraph" w:customStyle="1" w:styleId="Figure">
     <w:name w:val="Figure"/>
     <w:basedOn w:val="Normal"/>
   </w:style>
-  <w:style w:customStyle="1" w:styleId="CaptionedFigure" w:type="paragraph">
+  <w:style w:type="paragraph" w:customStyle="1" w:styleId="CaptionedFigure">
     <w:name w:val="Captioned Figure"/>
     <w:basedOn w:val="Figure"/>
     <w:pPr>
       <w:keepNext/>
     </w:pPr>
   </w:style>
-  <w:style w:customStyle="1" w:styleId="BodyTextChar" w:type="character">
+  <w:style w:type="character" w:customStyle="1" w:styleId="BodyTextChar">
     <w:name w:val="Body Text Char"/>
     <w:basedOn w:val="DefaultParagraphFont"/>
     <w:link w:val="BodyText"/>
   </w:style>
-  <w:style w:customStyle="1" w:styleId="VerbatimChar" w:type="character">
+  <w:style w:type="character" w:customStyle="1" w:styleId="VerbatimChar">
     <w:name w:val="Verbatim Char"/>
     <w:basedOn w:val="BodyTextChar"/>
     <w:rPr>
@@ -22759,25 +22670,25 @@
       <w:sz w:val="22"/>
     </w:rPr>
   </w:style>
-  <w:style w:customStyle="1" w:styleId="SectionNumber" w:type="character">
+  <w:style w:type="character" w:customStyle="1" w:styleId="SectionNumber">
     <w:name w:val="Section Number"/>
     <w:basedOn w:val="BodyTextChar"/>
   </w:style>
-  <w:style w:styleId="FootnoteReference" w:type="character">
+  <w:style w:type="character" w:styleId="FootnoteReference">
     <w:name w:val="Footnote Reference"/>
     <w:basedOn w:val="BodyTextChar"/>
     <w:rPr>
       <w:vertAlign w:val="superscript"/>
     </w:rPr>
   </w:style>
-  <w:style w:styleId="Hyperlink" w:type="character">
+  <w:style w:type="character" w:styleId="Hyperlink">
     <w:name w:val="Hyperlink"/>
     <w:basedOn w:val="BodyTextChar"/>
     <w:rPr>
-      <w:color w:themeColor="accent1" w:val="4F81BD"/>
+      <w:color w:val="4F81BD" w:themeColor="accent1"/>
     </w:rPr>
   </w:style>
-  <w:style w:styleId="TOCHeading" w:type="paragraph">
+  <w:style w:type="paragraph" w:styleId="TOCHeading">
     <w:name w:val="TOC Heading"/>
     <w:basedOn w:val="Heading1"/>
     <w:next w:val="BodyText"/>
@@ -22789,10 +22700,10 @@
       <w:outlineLvl w:val="9"/>
     </w:pPr>
     <w:rPr>
-      <w:rFonts w:asciiTheme="majorHAnsi" w:cstheme="majorBidi" w:eastAsiaTheme="majorEastAsia" w:hAnsiTheme="majorHAnsi"/>
+      <w:rFonts w:asciiTheme="majorHAnsi" w:eastAsiaTheme="majorEastAsia" w:hAnsiTheme="majorHAnsi" w:cstheme="majorBidi"/>
       <w:b w:val="0"/>
       <w:bCs w:val="0"/>
-      <w:color w:themeColor="accent1" w:themeShade="BF" w:val="365F91"/>
+      <w:color w:val="365F91" w:themeColor="accent1" w:themeShade="BF"/>
     </w:rPr>
   </w:style>
   <w:style w:type="paragraph" w:customStyle="1" w:styleId="SourceCode">

</xml_diff>